<commit_message>
Fix Tk test fixtures to reuse a shared hidden root
</commit_message>
<xml_diff>
--- a/附件_2026年辽宁省大学生计算机博弈大赛_程序设计说明书_更新.docx
+++ b/附件_2026年辽宁省大学生计算机博弈大赛_程序设计说明书_更新.docx
@@ -1,20 +1,20 @@
 
 <file path=word/document.xml><?xml version="1.0" encoding="utf-8"?>
-<w:document xmlns:wpc="http://schemas.microsoft.com/office/word/2010/wordprocessingCanvas" xmlns:mc="http://schemas.openxmlformats.org/markup-compatibility/2006" xmlns:o="urn:schemas-microsoft-com:office:office" xmlns:r="http://schemas.openxmlformats.org/officeDocument/2006/relationships" xmlns:m="http://schemas.openxmlformats.org/officeDocument/2006/math" xmlns:v="urn:schemas-microsoft-com:vml" xmlns:wp14="http://schemas.microsoft.com/office/word/2010/wordprocessingDrawing" xmlns:wp="http://schemas.openxmlformats.org/drawingml/2006/wordprocessingDrawing" xmlns:w="http://schemas.openxmlformats.org/wordprocessingml/2006/main" xmlns:w14="http://schemas.microsoft.com/office/word/2010/wordml" xmlns:w10="urn:schemas-microsoft-com:office:word" xmlns:w15="http://schemas.microsoft.com/office/word/2012/wordml" xmlns:wpg="http://schemas.microsoft.com/office/word/2010/wordprocessingGroup" xmlns:wpi="http://schemas.microsoft.com/office/word/2010/wordprocessingInk" xmlns:wne="http://schemas.microsoft.com/office/word/2006/wordml" xmlns:wps="http://schemas.microsoft.com/office/word/2010/wordprocessingShape" xmlns:wpsCustomData="http://www.wps.cn/officeDocument/2013/wpsCustomData" mc:Ignorable="w14 w15 wp14">
+<w:document xmlns:wpc="http://schemas.microsoft.com/office/word/2010/wordprocessingCanvas" xmlns:cx="http://schemas.microsoft.com/office/drawing/2014/chartex" xmlns:cx1="http://schemas.microsoft.com/office/drawing/2015/9/8/chartex" xmlns:cx2="http://schemas.microsoft.com/office/drawing/2015/10/21/chartex" xmlns:cx3="http://schemas.microsoft.com/office/drawing/2016/5/9/chartex" xmlns:cx4="http://schemas.microsoft.com/office/drawing/2016/5/10/chartex" xmlns:cx5="http://schemas.microsoft.com/office/drawing/2016/5/11/chartex" xmlns:cx6="http://schemas.microsoft.com/office/drawing/2016/5/12/chartex" xmlns:cx7="http://schemas.microsoft.com/office/drawing/2016/5/13/chartex" xmlns:cx8="http://schemas.microsoft.com/office/drawing/2016/5/14/chartex" xmlns:mc="http://schemas.openxmlformats.org/markup-compatibility/2006" xmlns:aink="http://schemas.microsoft.com/office/drawing/2016/ink" xmlns:am3d="http://schemas.microsoft.com/office/drawing/2017/model3d" xmlns:o="urn:schemas-microsoft-com:office:office" xmlns:oel="http://schemas.microsoft.com/office/2019/extlst" xmlns:r="http://schemas.openxmlformats.org/officeDocument/2006/relationships" xmlns:m="http://schemas.openxmlformats.org/officeDocument/2006/math" xmlns:v="urn:schemas-microsoft-com:vml" xmlns:wp14="http://schemas.microsoft.com/office/word/2010/wordprocessingDrawing" xmlns:wp="http://schemas.openxmlformats.org/drawingml/2006/wordprocessingDrawing" xmlns:w10="urn:schemas-microsoft-com:office:word" xmlns:w="http://schemas.openxmlformats.org/wordprocessingml/2006/main" xmlns:w14="http://schemas.microsoft.com/office/word/2010/wordml" xmlns:w15="http://schemas.microsoft.com/office/word/2012/wordml" xmlns:w16cex="http://schemas.microsoft.com/office/word/2018/wordml/cex" xmlns:w16cid="http://schemas.microsoft.com/office/word/2016/wordml/cid" xmlns:w16="http://schemas.microsoft.com/office/word/2018/wordml" xmlns:w16du="http://schemas.microsoft.com/office/word/2023/wordml/word16du" xmlns:w16sdtdh="http://schemas.microsoft.com/office/word/2020/wordml/sdtdatahash" xmlns:w16sdtfl="http://schemas.microsoft.com/office/word/2024/wordml/sdtformatlock" xmlns:w16se="http://schemas.microsoft.com/office/word/2015/wordml/symex" xmlns:wpg="http://schemas.microsoft.com/office/word/2010/wordprocessingGroup" xmlns:wpi="http://schemas.microsoft.com/office/word/2010/wordprocessingInk" xmlns:wne="http://schemas.microsoft.com/office/word/2006/wordml" xmlns:wps="http://schemas.microsoft.com/office/word/2010/wordprocessingShape" mc:Ignorable="w14 w15 w16se w16cid w16 w16cex w16sdtdh w16sdtfl w16du wp14">
   <w:body>
     <w:p>
       <w:pPr>
-        <w:spacing w:before="156" w:beforeLines="50"/>
+        <w:spacing w:beforeLines="50" w:before="156"/>
         <w:jc w:val="left"/>
         <w:rPr>
-          <w:rFonts w:ascii="仿宋" w:hAnsi="仿宋" w:eastAsia="仿宋"/>
+          <w:rFonts w:ascii="仿宋" w:eastAsia="仿宋" w:hAnsi="仿宋"/>
           <w:sz w:val="32"/>
           <w:szCs w:val="32"/>
         </w:rPr>
       </w:pPr>
       <w:r>
         <w:rPr>
-          <w:rFonts w:hint="eastAsia" w:ascii="仿宋" w:hAnsi="仿宋" w:eastAsia="仿宋"/>
+          <w:rFonts w:ascii="仿宋" w:eastAsia="仿宋" w:hAnsi="仿宋" w:hint="eastAsia"/>
           <w:sz w:val="32"/>
           <w:szCs w:val="32"/>
         </w:rPr>
@@ -23,7 +23,7 @@
     </w:p>
     <w:p>
       <w:pPr>
-        <w:spacing w:before="156" w:beforeLines="50"/>
+        <w:spacing w:beforeLines="50" w:before="156"/>
         <w:jc w:val="center"/>
         <w:rPr>
           <w:rFonts w:eastAsia="黑体"/>
@@ -37,12 +37,20 @@
           <w:sz w:val="40"/>
           <w:szCs w:val="40"/>
         </w:rPr>
-        <w:t>2026年辽宁省大学生计算机博弈大赛</w:t>
+        <w:t>2026</w:t>
+      </w:r>
+      <w:r>
+        <w:rPr>
+          <w:rFonts w:eastAsia="黑体"/>
+          <w:sz w:val="40"/>
+          <w:szCs w:val="40"/>
+        </w:rPr>
+        <w:t>年辽宁省大学生计算机博弈大赛</w:t>
       </w:r>
     </w:p>
     <w:p>
       <w:pPr>
-        <w:spacing w:before="156" w:beforeLines="50"/>
+        <w:spacing w:beforeLines="50" w:before="156"/>
         <w:jc w:val="center"/>
         <w:rPr>
           <w:b/>
@@ -64,7 +72,7 @@
         <w:spacing w:before="360"/>
         <w:jc w:val="center"/>
         <w:rPr>
-          <w:rFonts w:ascii="华文中宋" w:hAnsi="华文中宋" w:eastAsia="华文中宋"/>
+          <w:rFonts w:ascii="华文中宋" w:eastAsia="华文中宋" w:hAnsi="华文中宋"/>
           <w:b/>
           <w:spacing w:val="100"/>
           <w:sz w:val="52"/>
@@ -73,7 +81,7 @@
       </w:pPr>
       <w:r>
         <w:rPr>
-          <w:rFonts w:hint="eastAsia" w:ascii="华文中宋" w:hAnsi="华文中宋" w:eastAsia="华文中宋"/>
+          <w:rFonts w:ascii="华文中宋" w:eastAsia="华文中宋" w:hAnsi="华文中宋" w:hint="eastAsia"/>
           <w:b/>
           <w:spacing w:val="100"/>
           <w:sz w:val="52"/>
@@ -103,7 +111,7 @@
     <w:p>
       <w:pPr>
         <w:spacing w:line="600" w:lineRule="auto"/>
-        <w:ind w:firstLine="641" w:firstLineChars="200"/>
+        <w:ind w:firstLineChars="200" w:firstLine="643"/>
         <w:rPr>
           <w:b/>
           <w:sz w:val="32"/>
@@ -117,7 +125,34 @@
           <w:sz w:val="32"/>
           <w:szCs w:val="32"/>
         </w:rPr>
-        <w:t xml:space="preserve">所在单位(院校) </w:t>
+        <w:t>所在单位</w:t>
+      </w:r>
+      <w:r>
+        <w:rPr>
+          <w:rFonts w:hint="eastAsia"/>
+          <w:b/>
+          <w:sz w:val="32"/>
+          <w:szCs w:val="32"/>
+        </w:rPr>
+        <w:t>(</w:t>
+      </w:r>
+      <w:r>
+        <w:rPr>
+          <w:rFonts w:hint="eastAsia"/>
+          <w:b/>
+          <w:sz w:val="32"/>
+          <w:szCs w:val="32"/>
+        </w:rPr>
+        <w:t>院校</w:t>
+      </w:r>
+      <w:r>
+        <w:rPr>
+          <w:rFonts w:hint="eastAsia"/>
+          <w:b/>
+          <w:sz w:val="32"/>
+          <w:szCs w:val="32"/>
+        </w:rPr>
+        <w:t xml:space="preserve">) </w:t>
       </w:r>
       <w:r>
         <w:rPr>
@@ -127,13 +162,43 @@
           <w:szCs w:val="32"/>
           <w:u w:val="single"/>
         </w:rPr>
-        <w:t xml:space="preserve">                              </w:t>
+        <w:t xml:space="preserve">   </w:t>
+      </w:r>
+      <w:r>
+        <w:rPr>
+          <w:rFonts w:hint="eastAsia"/>
+          <w:b/>
+          <w:sz w:val="32"/>
+          <w:szCs w:val="32"/>
+          <w:u w:val="single"/>
+        </w:rPr>
+        <w:t xml:space="preserve"> </w:t>
+      </w:r>
+      <w:r>
+        <w:rPr>
+          <w:rFonts w:hint="eastAsia"/>
+          <w:b/>
+          <w:sz w:val="32"/>
+          <w:szCs w:val="32"/>
+          <w:u w:val="single"/>
+        </w:rPr>
+        <w:t>沈阳师范大学人工智能学院</w:t>
+      </w:r>
+      <w:r>
+        <w:rPr>
+          <w:rFonts w:hint="eastAsia"/>
+          <w:b/>
+          <w:sz w:val="32"/>
+          <w:szCs w:val="32"/>
+          <w:u w:val="single"/>
+        </w:rPr>
+        <w:t xml:space="preserve">                    </w:t>
       </w:r>
     </w:p>
     <w:p>
       <w:pPr>
         <w:spacing w:line="600" w:lineRule="auto"/>
-        <w:ind w:firstLine="641" w:firstLineChars="200"/>
+        <w:ind w:firstLineChars="200" w:firstLine="643"/>
         <w:rPr>
           <w:b/>
           <w:sz w:val="32"/>
@@ -147,7 +212,34 @@
           <w:sz w:val="32"/>
           <w:szCs w:val="32"/>
         </w:rPr>
-        <w:t xml:space="preserve">参赛项目(棋类) </w:t>
+        <w:t>参赛项目</w:t>
+      </w:r>
+      <w:r>
+        <w:rPr>
+          <w:rFonts w:hint="eastAsia"/>
+          <w:b/>
+          <w:sz w:val="32"/>
+          <w:szCs w:val="32"/>
+        </w:rPr>
+        <w:t>(</w:t>
+      </w:r>
+      <w:r>
+        <w:rPr>
+          <w:rFonts w:hint="eastAsia"/>
+          <w:b/>
+          <w:sz w:val="32"/>
+          <w:szCs w:val="32"/>
+        </w:rPr>
+        <w:t>棋类</w:t>
+      </w:r>
+      <w:r>
+        <w:rPr>
+          <w:rFonts w:hint="eastAsia"/>
+          <w:b/>
+          <w:sz w:val="32"/>
+          <w:szCs w:val="32"/>
+        </w:rPr>
+        <w:t xml:space="preserve">) </w:t>
       </w:r>
       <w:r>
         <w:rPr>
@@ -157,13 +249,33 @@
           <w:szCs w:val="32"/>
           <w:u w:val="single"/>
         </w:rPr>
-        <w:t xml:space="preserve">                              </w:t>
+        <w:t xml:space="preserve">    </w:t>
+      </w:r>
+      <w:r>
+        <w:rPr>
+          <w:rFonts w:hint="eastAsia"/>
+          <w:b/>
+          <w:sz w:val="32"/>
+          <w:szCs w:val="32"/>
+          <w:u w:val="single"/>
+        </w:rPr>
+        <w:t>爱恩斯坦棋</w:t>
+      </w:r>
+      <w:r>
+        <w:rPr>
+          <w:rFonts w:hint="eastAsia"/>
+          <w:b/>
+          <w:sz w:val="32"/>
+          <w:szCs w:val="32"/>
+          <w:u w:val="single"/>
+        </w:rPr>
+        <w:t xml:space="preserve">                          </w:t>
       </w:r>
     </w:p>
     <w:p>
       <w:pPr>
         <w:spacing w:line="600" w:lineRule="auto"/>
-        <w:ind w:firstLine="641" w:firstLineChars="200"/>
+        <w:ind w:firstLineChars="200" w:firstLine="643"/>
         <w:rPr>
           <w:b/>
           <w:sz w:val="32"/>
@@ -177,7 +289,34 @@
           <w:sz w:val="32"/>
           <w:szCs w:val="32"/>
         </w:rPr>
-        <w:t xml:space="preserve">程序名称(中文) </w:t>
+        <w:t>程序名称</w:t>
+      </w:r>
+      <w:r>
+        <w:rPr>
+          <w:rFonts w:hint="eastAsia"/>
+          <w:b/>
+          <w:sz w:val="32"/>
+          <w:szCs w:val="32"/>
+        </w:rPr>
+        <w:t>(</w:t>
+      </w:r>
+      <w:r>
+        <w:rPr>
+          <w:rFonts w:hint="eastAsia"/>
+          <w:b/>
+          <w:sz w:val="32"/>
+          <w:szCs w:val="32"/>
+        </w:rPr>
+        <w:t>中文</w:t>
+      </w:r>
+      <w:r>
+        <w:rPr>
+          <w:rFonts w:hint="eastAsia"/>
+          <w:b/>
+          <w:sz w:val="32"/>
+          <w:szCs w:val="32"/>
+        </w:rPr>
+        <w:t xml:space="preserve">) </w:t>
       </w:r>
       <w:r>
         <w:rPr>
@@ -187,13 +326,32 @@
           <w:szCs w:val="32"/>
           <w:u w:val="single"/>
         </w:rPr>
-        <w:t xml:space="preserve">                              </w:t>
+        <w:t xml:space="preserve">    </w:t>
+      </w:r>
+      <w:r>
+        <w:rPr>
+          <w:b/>
+          <w:sz w:val="32"/>
+          <w:szCs w:val="32"/>
+          <w:u w:val="single"/>
+        </w:rPr>
+        <w:t>爱恩斯坦棋离线博弈程序</w:t>
+      </w:r>
+      <w:r>
+        <w:rPr>
+          <w:rFonts w:hint="eastAsia"/>
+          <w:b/>
+          <w:sz w:val="32"/>
+          <w:szCs w:val="32"/>
+          <w:u w:val="single"/>
+        </w:rPr>
+        <w:t xml:space="preserve">                          </w:t>
       </w:r>
     </w:p>
     <w:p>
       <w:pPr>
         <w:spacing w:line="600" w:lineRule="auto"/>
-        <w:ind w:firstLine="641" w:firstLineChars="200"/>
+        <w:ind w:firstLineChars="200" w:firstLine="643"/>
         <w:rPr>
           <w:b/>
           <w:sz w:val="32"/>
@@ -207,7 +365,34 @@
           <w:sz w:val="32"/>
           <w:szCs w:val="32"/>
         </w:rPr>
-        <w:t xml:space="preserve">程序名称(英文) </w:t>
+        <w:t>程序名称</w:t>
+      </w:r>
+      <w:r>
+        <w:rPr>
+          <w:rFonts w:hint="eastAsia"/>
+          <w:b/>
+          <w:sz w:val="32"/>
+          <w:szCs w:val="32"/>
+        </w:rPr>
+        <w:t>(</w:t>
+      </w:r>
+      <w:r>
+        <w:rPr>
+          <w:rFonts w:hint="eastAsia"/>
+          <w:b/>
+          <w:sz w:val="32"/>
+          <w:szCs w:val="32"/>
+        </w:rPr>
+        <w:t>英文</w:t>
+      </w:r>
+      <w:r>
+        <w:rPr>
+          <w:rFonts w:hint="eastAsia"/>
+          <w:b/>
+          <w:sz w:val="32"/>
+          <w:szCs w:val="32"/>
+        </w:rPr>
+        <w:t xml:space="preserve">) </w:t>
       </w:r>
       <w:r>
         <w:rPr>
@@ -217,13 +402,32 @@
           <w:szCs w:val="32"/>
           <w:u w:val="single"/>
         </w:rPr>
-        <w:t xml:space="preserve">                              </w:t>
+        <w:t xml:space="preserve">    </w:t>
+      </w:r>
+      <w:r>
+        <w:rPr>
+          <w:b/>
+          <w:sz w:val="32"/>
+          <w:szCs w:val="32"/>
+          <w:u w:val="single"/>
+        </w:rPr>
+        <w:t>Einstein Chess Offline AI</w:t>
+      </w:r>
+      <w:r>
+        <w:rPr>
+          <w:rFonts w:hint="eastAsia"/>
+          <w:b/>
+          <w:sz w:val="32"/>
+          <w:szCs w:val="32"/>
+          <w:u w:val="single"/>
+        </w:rPr>
+        <w:t xml:space="preserve">                          </w:t>
       </w:r>
     </w:p>
     <w:p>
       <w:pPr>
         <w:spacing w:line="600" w:lineRule="auto"/>
-        <w:ind w:firstLine="641" w:firstLineChars="200"/>
+        <w:ind w:firstLineChars="200" w:firstLine="643"/>
         <w:rPr>
           <w:b/>
           <w:sz w:val="32"/>
@@ -237,7 +441,34 @@
           <w:sz w:val="32"/>
           <w:szCs w:val="32"/>
         </w:rPr>
-        <w:t>程序第一作者(签名)</w:t>
+        <w:t>程序第一作者</w:t>
+      </w:r>
+      <w:r>
+        <w:rPr>
+          <w:rFonts w:hint="eastAsia"/>
+          <w:b/>
+          <w:sz w:val="32"/>
+          <w:szCs w:val="32"/>
+        </w:rPr>
+        <w:t>(</w:t>
+      </w:r>
+      <w:r>
+        <w:rPr>
+          <w:rFonts w:hint="eastAsia"/>
+          <w:b/>
+          <w:sz w:val="32"/>
+          <w:szCs w:val="32"/>
+        </w:rPr>
+        <w:t>签名</w:t>
+      </w:r>
+      <w:r>
+        <w:rPr>
+          <w:rFonts w:hint="eastAsia"/>
+          <w:b/>
+          <w:sz w:val="32"/>
+          <w:szCs w:val="32"/>
+        </w:rPr>
+        <w:t>)</w:t>
       </w:r>
       <w:r>
         <w:rPr>
@@ -247,13 +478,33 @@
           <w:szCs w:val="32"/>
           <w:u w:val="single"/>
         </w:rPr>
-        <w:t xml:space="preserve">                           </w:t>
+        <w:t xml:space="preserve">                     </w:t>
+      </w:r>
+      <w:r>
+        <w:rPr>
+          <w:rFonts w:hint="eastAsia"/>
+          <w:b/>
+          <w:sz w:val="32"/>
+          <w:szCs w:val="32"/>
+          <w:u w:val="single"/>
+        </w:rPr>
+        <w:t xml:space="preserve">   </w:t>
+      </w:r>
+      <w:r>
+        <w:rPr>
+          <w:rFonts w:hint="eastAsia"/>
+          <w:b/>
+          <w:sz w:val="32"/>
+          <w:szCs w:val="32"/>
+          <w:u w:val="single"/>
+        </w:rPr>
+        <w:t xml:space="preserve">      </w:t>
       </w:r>
     </w:p>
     <w:p>
       <w:pPr>
         <w:spacing w:line="600" w:lineRule="auto"/>
-        <w:ind w:firstLine="641" w:firstLineChars="200"/>
+        <w:ind w:firstLineChars="200" w:firstLine="643"/>
         <w:rPr>
           <w:b/>
           <w:sz w:val="32"/>
@@ -268,7 +519,34 @@
           <w:sz w:val="32"/>
           <w:szCs w:val="32"/>
         </w:rPr>
-        <w:t>程序其他作者(签名)</w:t>
+        <w:t>程序其他作者</w:t>
+      </w:r>
+      <w:r>
+        <w:rPr>
+          <w:rFonts w:hint="eastAsia"/>
+          <w:b/>
+          <w:sz w:val="32"/>
+          <w:szCs w:val="32"/>
+        </w:rPr>
+        <w:t>(</w:t>
+      </w:r>
+      <w:r>
+        <w:rPr>
+          <w:rFonts w:hint="eastAsia"/>
+          <w:b/>
+          <w:sz w:val="32"/>
+          <w:szCs w:val="32"/>
+        </w:rPr>
+        <w:t>签名</w:t>
+      </w:r>
+      <w:r>
+        <w:rPr>
+          <w:rFonts w:hint="eastAsia"/>
+          <w:b/>
+          <w:sz w:val="32"/>
+          <w:szCs w:val="32"/>
+        </w:rPr>
+        <w:t>)</w:t>
       </w:r>
       <w:r>
         <w:rPr>
@@ -278,13 +556,33 @@
           <w:szCs w:val="32"/>
           <w:u w:val="single"/>
         </w:rPr>
-        <w:t xml:space="preserve">                           </w:t>
+        <w:t xml:space="preserve">                    </w:t>
+      </w:r>
+      <w:r>
+        <w:rPr>
+          <w:rFonts w:hint="eastAsia"/>
+          <w:b/>
+          <w:sz w:val="32"/>
+          <w:szCs w:val="32"/>
+          <w:u w:val="single"/>
+        </w:rPr>
+        <w:t xml:space="preserve">   </w:t>
+      </w:r>
+      <w:r>
+        <w:rPr>
+          <w:rFonts w:hint="eastAsia"/>
+          <w:b/>
+          <w:sz w:val="32"/>
+          <w:szCs w:val="32"/>
+          <w:u w:val="single"/>
+        </w:rPr>
+        <w:t xml:space="preserve">       </w:t>
       </w:r>
     </w:p>
     <w:p>
       <w:pPr>
         <w:spacing w:line="600" w:lineRule="auto"/>
-        <w:ind w:firstLine="641" w:firstLineChars="200"/>
+        <w:ind w:firstLineChars="200" w:firstLine="643"/>
         <w:rPr>
           <w:b/>
           <w:sz w:val="32"/>
@@ -298,7 +596,34 @@
           <w:sz w:val="32"/>
           <w:szCs w:val="32"/>
         </w:rPr>
-        <w:t>指导教师(签名)</w:t>
+        <w:t>指导教师</w:t>
+      </w:r>
+      <w:r>
+        <w:rPr>
+          <w:rFonts w:hint="eastAsia"/>
+          <w:b/>
+          <w:sz w:val="32"/>
+          <w:szCs w:val="32"/>
+        </w:rPr>
+        <w:t>(</w:t>
+      </w:r>
+      <w:r>
+        <w:rPr>
+          <w:rFonts w:hint="eastAsia"/>
+          <w:b/>
+          <w:sz w:val="32"/>
+          <w:szCs w:val="32"/>
+        </w:rPr>
+        <w:t>签名</w:t>
+      </w:r>
+      <w:r>
+        <w:rPr>
+          <w:rFonts w:hint="eastAsia"/>
+          <w:b/>
+          <w:sz w:val="32"/>
+          <w:szCs w:val="32"/>
+        </w:rPr>
+        <w:t>)</w:t>
       </w:r>
       <w:r>
         <w:rPr>
@@ -308,7 +633,27 @@
           <w:szCs w:val="32"/>
           <w:u w:val="single"/>
         </w:rPr>
-        <w:t xml:space="preserve">                               </w:t>
+        <w:t xml:space="preserve">                       </w:t>
+      </w:r>
+      <w:r>
+        <w:rPr>
+          <w:rFonts w:hint="eastAsia"/>
+          <w:b/>
+          <w:sz w:val="32"/>
+          <w:szCs w:val="32"/>
+          <w:u w:val="single"/>
+        </w:rPr>
+        <w:t xml:space="preserve">   </w:t>
+      </w:r>
+      <w:r>
+        <w:rPr>
+          <w:rFonts w:hint="eastAsia"/>
+          <w:b/>
+          <w:sz w:val="32"/>
+          <w:szCs w:val="32"/>
+          <w:u w:val="single"/>
+        </w:rPr>
+        <w:t xml:space="preserve">        </w:t>
       </w:r>
       <w:r>
         <w:rPr>
@@ -360,6 +705,7 @@
       <w:pPr>
         <w:jc w:val="center"/>
         <w:rPr>
+          <w:rFonts w:hint="eastAsia"/>
           <w:sz w:val="32"/>
           <w:szCs w:val="32"/>
         </w:rPr>
@@ -370,12 +716,108 @@
           <w:sz w:val="32"/>
           <w:szCs w:val="32"/>
         </w:rPr>
-        <w:t>填表日期：       年    月    日</w:t>
+        <w:t>填表日期：</w:t>
+      </w:r>
+      <w:r>
+        <w:rPr>
+          <w:rFonts w:hint="eastAsia"/>
+          <w:sz w:val="32"/>
+          <w:szCs w:val="32"/>
+        </w:rPr>
+        <w:t xml:space="preserve">    </w:t>
+      </w:r>
+      <w:r>
+        <w:rPr>
+          <w:rFonts w:hint="eastAsia"/>
+          <w:sz w:val="32"/>
+          <w:szCs w:val="32"/>
+        </w:rPr>
+        <w:t>2026</w:t>
+      </w:r>
+      <w:r>
+        <w:rPr>
+          <w:rFonts w:hint="eastAsia"/>
+          <w:sz w:val="32"/>
+          <w:szCs w:val="32"/>
+        </w:rPr>
+        <w:t xml:space="preserve">   </w:t>
+      </w:r>
+      <w:r>
+        <w:rPr>
+          <w:rFonts w:hint="eastAsia"/>
+          <w:sz w:val="32"/>
+          <w:szCs w:val="32"/>
+        </w:rPr>
+        <w:t>年</w:t>
+      </w:r>
+      <w:r>
+        <w:rPr>
+          <w:rFonts w:hint="eastAsia"/>
+          <w:sz w:val="32"/>
+          <w:szCs w:val="32"/>
+        </w:rPr>
+        <w:t xml:space="preserve">  </w:t>
+      </w:r>
+      <w:r>
+        <w:rPr>
+          <w:rFonts w:hint="eastAsia"/>
+          <w:sz w:val="32"/>
+          <w:szCs w:val="32"/>
+        </w:rPr>
+        <w:t>5</w:t>
+      </w:r>
+      <w:r>
+        <w:rPr>
+          <w:rFonts w:hint="eastAsia"/>
+          <w:sz w:val="32"/>
+          <w:szCs w:val="32"/>
+        </w:rPr>
+        <w:t xml:space="preserve">  </w:t>
+      </w:r>
+      <w:r>
+        <w:rPr>
+          <w:rFonts w:hint="eastAsia"/>
+          <w:sz w:val="32"/>
+          <w:szCs w:val="32"/>
+        </w:rPr>
+        <w:t>月</w:t>
+      </w:r>
+      <w:r>
+        <w:rPr>
+          <w:rFonts w:hint="eastAsia"/>
+          <w:sz w:val="32"/>
+          <w:szCs w:val="32"/>
+        </w:rPr>
+        <w:t xml:space="preserve">  </w:t>
+      </w:r>
+      <w:r>
+        <w:rPr>
+          <w:rFonts w:hint="eastAsia"/>
+          <w:sz w:val="32"/>
+          <w:szCs w:val="32"/>
+        </w:rPr>
+        <w:t>14</w:t>
+      </w:r>
+      <w:r>
+        <w:rPr>
+          <w:rFonts w:hint="eastAsia"/>
+          <w:sz w:val="32"/>
+          <w:szCs w:val="32"/>
+        </w:rPr>
+        <w:t xml:space="preserve">  </w:t>
+      </w:r>
+      <w:r>
+        <w:rPr>
+          <w:rFonts w:hint="eastAsia"/>
+          <w:sz w:val="32"/>
+          <w:szCs w:val="32"/>
+        </w:rPr>
+        <w:t>日</w:t>
       </w:r>
     </w:p>
     <w:p>
       <w:pPr>
-        <w:spacing w:after="156" w:afterLines="50"/>
+        <w:spacing w:afterLines="50" w:after="156"/>
         <w:jc w:val="center"/>
         <w:rPr>
           <w:sz w:val="28"/>
@@ -395,13 +837,14 @@
           <w:sz w:val="28"/>
           <w:szCs w:val="28"/>
         </w:rPr>
+        <w:lastRenderedPageBreak/>
         <w:t>填表说明</w:t>
       </w:r>
     </w:p>
     <w:p>
       <w:pPr>
         <w:spacing w:line="360" w:lineRule="auto"/>
-        <w:ind w:left="307" w:hanging="307" w:hangingChars="128"/>
+        <w:ind w:left="307" w:hangingChars="128" w:hanging="307"/>
         <w:rPr>
           <w:sz w:val="24"/>
         </w:rPr>
@@ -411,7 +854,14 @@
           <w:rFonts w:hint="eastAsia"/>
           <w:sz w:val="24"/>
         </w:rPr>
-        <w:t>1．关于封面的程序名称，至少要填写中文名称。</w:t>
+        <w:t>1</w:t>
+      </w:r>
+      <w:r>
+        <w:rPr>
+          <w:rFonts w:hint="eastAsia"/>
+          <w:sz w:val="24"/>
+        </w:rPr>
+        <w:t>．关于封面的程序名称，至少要填写中文名称。</w:t>
       </w:r>
     </w:p>
     <w:p>
@@ -426,7 +876,30 @@
           <w:rFonts w:hint="eastAsia"/>
           <w:sz w:val="24"/>
         </w:rPr>
-        <w:t>2．正文各项内容如果空白页不足时，可增页。</w:t>
+        <w:t>2</w:t>
+      </w:r>
+      <w:r>
+        <w:rPr>
+          <w:rFonts w:hint="eastAsia"/>
+          <w:sz w:val="24"/>
+        </w:rPr>
+        <w:t>．正文各项内容如果空白</w:t>
+      </w:r>
+      <w:proofErr w:type="gramStart"/>
+      <w:r>
+        <w:rPr>
+          <w:rFonts w:hint="eastAsia"/>
+          <w:sz w:val="24"/>
+        </w:rPr>
+        <w:t>页不足</w:t>
+      </w:r>
+      <w:proofErr w:type="gramEnd"/>
+      <w:r>
+        <w:rPr>
+          <w:rFonts w:hint="eastAsia"/>
+          <w:sz w:val="24"/>
+        </w:rPr>
+        <w:t>时，可增页。</w:t>
       </w:r>
     </w:p>
     <w:p>
@@ -441,7 +914,28 @@
           <w:rFonts w:hint="eastAsia"/>
           <w:sz w:val="24"/>
         </w:rPr>
-        <w:t>3．请用小四号宋体字、1.5倍行距。</w:t>
+        <w:t>3</w:t>
+      </w:r>
+      <w:r>
+        <w:rPr>
+          <w:rFonts w:hint="eastAsia"/>
+          <w:sz w:val="24"/>
+        </w:rPr>
+        <w:t>．请用小四号宋体字、</w:t>
+      </w:r>
+      <w:r>
+        <w:rPr>
+          <w:rFonts w:hint="eastAsia"/>
+          <w:sz w:val="24"/>
+        </w:rPr>
+        <w:t>1.5</w:t>
+      </w:r>
+      <w:r>
+        <w:rPr>
+          <w:rFonts w:hint="eastAsia"/>
+          <w:sz w:val="24"/>
+        </w:rPr>
+        <w:t>倍行距。</w:t>
       </w:r>
     </w:p>
     <w:p>
@@ -456,13 +950,50 @@
           <w:rFonts w:hint="eastAsia"/>
           <w:sz w:val="24"/>
         </w:rPr>
-        <w:t>4．说明书的首页需签字后，生成PDF电子版。在网上报名系统中提交设计文档，以此作为参赛的依据，不提交者视为弃赛。参赛时，自带一份纸质版。</w:t>
+        <w:t>4</w:t>
+      </w:r>
+      <w:r>
+        <w:rPr>
+          <w:rFonts w:hint="eastAsia"/>
+          <w:sz w:val="24"/>
+        </w:rPr>
+        <w:t>．说明书的</w:t>
+      </w:r>
+      <w:proofErr w:type="gramStart"/>
+      <w:r>
+        <w:rPr>
+          <w:rFonts w:hint="eastAsia"/>
+          <w:sz w:val="24"/>
+        </w:rPr>
+        <w:t>首页需</w:t>
+      </w:r>
+      <w:proofErr w:type="gramEnd"/>
+      <w:r>
+        <w:rPr>
+          <w:rFonts w:hint="eastAsia"/>
+          <w:sz w:val="24"/>
+        </w:rPr>
+        <w:t>签字后，生成</w:t>
+      </w:r>
+      <w:r>
+        <w:rPr>
+          <w:rFonts w:hint="eastAsia"/>
+          <w:sz w:val="24"/>
+        </w:rPr>
+        <w:t>PDF</w:t>
+      </w:r>
+      <w:r>
+        <w:rPr>
+          <w:rFonts w:hint="eastAsia"/>
+          <w:sz w:val="24"/>
+        </w:rPr>
+        <w:t>电子版。在网上报名系统中提交设计文档，以此作为参赛的依据，不提交者视为弃赛。参赛时，自带一份纸质版。</w:t>
       </w:r>
     </w:p>
     <w:p>
       <w:pPr>
         <w:spacing w:line="360" w:lineRule="auto"/>
-        <w:ind w:left="365" w:hanging="364" w:hangingChars="152"/>
+        <w:ind w:left="365" w:hangingChars="152" w:hanging="365"/>
         <w:rPr>
           <w:sz w:val="24"/>
         </w:rPr>
@@ -472,7 +1003,14 @@
           <w:rFonts w:hint="eastAsia"/>
           <w:sz w:val="24"/>
         </w:rPr>
-        <w:t>4  说明书所填写内容将作为专家对程序的定性评价和大赛的交流，也作为参赛和被质疑时答辩的依据。</w:t>
+        <w:t xml:space="preserve">4  </w:t>
+      </w:r>
+      <w:r>
+        <w:rPr>
+          <w:rFonts w:hint="eastAsia"/>
+          <w:sz w:val="24"/>
+        </w:rPr>
+        <w:t>说明书所填写内容将作为专家对程序的定性评价和大赛的交流，也作为参赛和被质疑时答辩的依据。</w:t>
       </w:r>
     </w:p>
     <w:p>
@@ -487,13 +1025,20 @@
           <w:rFonts w:hint="eastAsia"/>
           <w:sz w:val="24"/>
         </w:rPr>
-        <w:t>5．文中红色部分为样例，可删除。</w:t>
+        <w:t>5</w:t>
+      </w:r>
+      <w:r>
+        <w:rPr>
+          <w:rFonts w:hint="eastAsia"/>
+          <w:sz w:val="24"/>
+        </w:rPr>
+        <w:t>．文中红色部分为样例，可删除。</w:t>
       </w:r>
     </w:p>
     <w:p>
       <w:pPr>
         <w:spacing w:line="360" w:lineRule="auto"/>
-        <w:ind w:left="365" w:hanging="364" w:hangingChars="152"/>
+        <w:ind w:left="365" w:hangingChars="152" w:hanging="365"/>
         <w:rPr>
           <w:sz w:val="24"/>
         </w:rPr>
@@ -501,7 +1046,7 @@
     </w:p>
     <w:p>
       <w:pPr>
-        <w:spacing w:before="156" w:beforeLines="50"/>
+        <w:spacing w:beforeLines="50" w:before="156"/>
         <w:rPr>
           <w:b/>
           <w:sz w:val="28"/>
@@ -522,46 +1067,31 @@
           <w:sz w:val="28"/>
           <w:szCs w:val="28"/>
         </w:rPr>
+        <w:lastRenderedPageBreak/>
         <w:t>一、程序成长历程</w:t>
       </w:r>
     </w:p>
     <w:tbl>
       <w:tblPr>
-        <w:tblStyle w:val="4"/>
         <w:tblW w:w="0" w:type="auto"/>
         <w:tblInd w:w="-116" w:type="dxa"/>
         <w:tblBorders>
-          <w:top w:val="single" w:color="auto" w:sz="4" w:space="0"/>
-          <w:left w:val="single" w:color="auto" w:sz="4" w:space="0"/>
-          <w:bottom w:val="single" w:color="auto" w:sz="4" w:space="0"/>
-          <w:right w:val="single" w:color="auto" w:sz="4" w:space="0"/>
-          <w:insideH w:val="single" w:color="auto" w:sz="4" w:space="0"/>
-          <w:insideV w:val="single" w:color="auto" w:sz="4" w:space="0"/>
+          <w:top w:val="single" w:sz="4" w:space="0" w:color="auto"/>
+          <w:left w:val="single" w:sz="4" w:space="0" w:color="auto"/>
+          <w:bottom w:val="single" w:sz="4" w:space="0" w:color="auto"/>
+          <w:right w:val="single" w:sz="4" w:space="0" w:color="auto"/>
+          <w:insideH w:val="single" w:sz="4" w:space="0" w:color="auto"/>
+          <w:insideV w:val="single" w:sz="4" w:space="0" w:color="auto"/>
         </w:tblBorders>
         <w:tblLayout w:type="fixed"/>
-        <w:tblCellMar>
-          <w:top w:w="0" w:type="dxa"/>
-          <w:left w:w="108" w:type="dxa"/>
-          <w:bottom w:w="0" w:type="dxa"/>
-          <w:right w:w="108" w:type="dxa"/>
-        </w:tblCellMar>
+        <w:tblLook w:val="04A0" w:firstRow="1" w:lastRow="0" w:firstColumn="1" w:lastColumn="0" w:noHBand="0" w:noVBand="1"/>
       </w:tblPr>
       <w:tblGrid>
         <w:gridCol w:w="8928"/>
       </w:tblGrid>
       <w:tr>
-        <w:tblPrEx>
-          <w:tblBorders>
-            <w:top w:val="single" w:color="auto" w:sz="4" w:space="0"/>
-            <w:left w:val="single" w:color="auto" w:sz="4" w:space="0"/>
-            <w:bottom w:val="single" w:color="auto" w:sz="4" w:space="0"/>
-            <w:right w:val="single" w:color="auto" w:sz="4" w:space="0"/>
-            <w:insideH w:val="single" w:color="auto" w:sz="4" w:space="0"/>
-            <w:insideV w:val="single" w:color="auto" w:sz="4" w:space="0"/>
-          </w:tblBorders>
-        </w:tblPrEx>
         <w:trPr>
-          <w:trHeight w:val="12925" w:hRule="atLeast"/>
+          <w:trHeight w:val="12925"/>
         </w:trPr>
         <w:tc>
           <w:tcPr>
@@ -591,7 +1121,14 @@
                 <w:rFonts w:hint="eastAsia"/>
                 <w:szCs w:val="21"/>
               </w:rPr>
-              <w:t xml:space="preserve">。 </w:t>
+              <w:t>。</w:t>
+            </w:r>
+            <w:r>
+              <w:rPr>
+                <w:rFonts w:hint="eastAsia"/>
+                <w:szCs w:val="21"/>
+              </w:rPr>
+              <w:t xml:space="preserve"> </w:t>
             </w:r>
           </w:p>
           <w:p>
@@ -608,64 +1145,63 @@
                 <w:b/>
                 <w:sz w:val="24"/>
               </w:rPr>
-              <w:t>1．程序的起源及成长过程</w:t>
-            </w:r>
-          </w:p>
-          <w:p>
-            <w:pPr>
-              <w:spacing w:line="360" w:lineRule="auto"/>
-              <w:rPr>
-                <w:sz w:val="24"/>
-              </w:rPr>
-            </w:pPr>
-          </w:p>
-          <w:p>
-            <w:pPr>
-              <w:spacing w:line="360" w:lineRule="auto"/>
-              <w:rPr>
-                <w:sz w:val="24"/>
-              </w:rPr>
-            </w:pPr>
-          </w:p>
-          <w:p>
-            <w:pPr>
-              <w:spacing w:line="360" w:lineRule="auto"/>
-              <w:rPr>
-                <w:sz w:val="24"/>
-              </w:rPr>
-            </w:pPr>
-          </w:p>
-          <w:p>
-            <w:pPr>
-              <w:spacing w:line="360" w:lineRule="auto"/>
-              <w:rPr>
-                <w:sz w:val="24"/>
-              </w:rPr>
-            </w:pPr>
-          </w:p>
-          <w:p>
-            <w:pPr>
-              <w:spacing w:line="360" w:lineRule="auto"/>
-              <w:rPr>
-                <w:sz w:val="24"/>
-              </w:rPr>
-            </w:pPr>
-          </w:p>
-          <w:p>
-            <w:pPr>
-              <w:spacing w:line="360" w:lineRule="auto"/>
-              <w:rPr>
-                <w:sz w:val="24"/>
-              </w:rPr>
-            </w:pPr>
-          </w:p>
-          <w:p>
-            <w:pPr>
-              <w:spacing w:line="360" w:lineRule="auto"/>
-              <w:rPr>
+              <w:t>1</w:t>
+            </w:r>
+            <w:r>
+              <w:rPr>
+                <w:rFonts w:hint="eastAsia"/>
                 <w:b/>
                 <w:sz w:val="24"/>
               </w:rPr>
+              <w:t>．程序的起源及成长过程</w:t>
+            </w:r>
+          </w:p>
+          <w:p>
+            <w:pPr>
+              <w:spacing w:line="360" w:lineRule="auto"/>
+              <w:rPr>
+                <w:sz w:val="24"/>
+              </w:rPr>
+            </w:pPr>
+          </w:p>
+          <w:p>
+            <w:pPr>
+              <w:spacing w:line="360" w:lineRule="auto"/>
+              <w:rPr>
+                <w:sz w:val="24"/>
+              </w:rPr>
+            </w:pPr>
+          </w:p>
+          <w:p>
+            <w:pPr>
+              <w:spacing w:line="360" w:lineRule="auto"/>
+              <w:rPr>
+                <w:sz w:val="24"/>
+              </w:rPr>
+            </w:pPr>
+          </w:p>
+          <w:p>
+            <w:pPr>
+              <w:spacing w:line="360" w:lineRule="auto"/>
+              <w:rPr>
+                <w:sz w:val="24"/>
+              </w:rPr>
+            </w:pPr>
+          </w:p>
+          <w:p>
+            <w:pPr>
+              <w:spacing w:line="360" w:lineRule="auto"/>
+              <w:rPr>
+                <w:sz w:val="24"/>
+              </w:rPr>
+            </w:pPr>
+          </w:p>
+          <w:p>
+            <w:pPr>
+              <w:spacing w:line="360" w:lineRule="auto"/>
+              <w:rPr>
+                <w:sz w:val="24"/>
+              </w:rPr>
             </w:pPr>
           </w:p>
           <w:p>
@@ -694,62 +1230,87 @@
                 <w:sz w:val="24"/>
               </w:rPr>
             </w:pPr>
-            <w:r>
-              <w:rPr>
-                <w:rFonts w:hint="eastAsia"/>
+          </w:p>
+          <w:p>
+            <w:pPr>
+              <w:spacing w:line="360" w:lineRule="auto"/>
+              <w:rPr>
                 <w:b/>
                 <w:sz w:val="24"/>
               </w:rPr>
-              <w:t>2．程序的开发语言和调试环境</w:t>
-            </w:r>
-          </w:p>
-          <w:p>
-            <w:pPr>
-              <w:spacing w:line="360" w:lineRule="auto"/>
-              <w:rPr>
-                <w:sz w:val="24"/>
-              </w:rPr>
-            </w:pPr>
-          </w:p>
-          <w:p>
-            <w:pPr>
-              <w:spacing w:line="360" w:lineRule="auto"/>
-              <w:rPr>
-                <w:sz w:val="24"/>
-              </w:rPr>
-            </w:pPr>
-          </w:p>
-          <w:p>
-            <w:pPr>
-              <w:spacing w:line="360" w:lineRule="auto"/>
-              <w:rPr>
-                <w:sz w:val="24"/>
-              </w:rPr>
-            </w:pPr>
-          </w:p>
-          <w:p>
-            <w:pPr>
-              <w:spacing w:line="360" w:lineRule="auto"/>
-              <w:rPr>
-                <w:sz w:val="24"/>
-              </w:rPr>
-            </w:pPr>
-          </w:p>
-          <w:p>
-            <w:pPr>
-              <w:spacing w:line="360" w:lineRule="auto"/>
-              <w:rPr>
+            </w:pPr>
+            <w:r>
+              <w:rPr>
+                <w:rFonts w:hint="eastAsia"/>
                 <w:b/>
                 <w:sz w:val="24"/>
               </w:rPr>
-            </w:pPr>
+              <w:t>2</w:t>
+            </w:r>
             <w:r>
               <w:rPr>
                 <w:rFonts w:hint="eastAsia"/>
                 <w:b/>
                 <w:sz w:val="24"/>
               </w:rPr>
-              <w:t>3．参赛成员信息及主要工作</w:t>
+              <w:t>．程序的开发语言和调试环境</w:t>
+            </w:r>
+          </w:p>
+          <w:p>
+            <w:pPr>
+              <w:spacing w:line="360" w:lineRule="auto"/>
+              <w:rPr>
+                <w:sz w:val="24"/>
+              </w:rPr>
+            </w:pPr>
+          </w:p>
+          <w:p>
+            <w:pPr>
+              <w:spacing w:line="360" w:lineRule="auto"/>
+              <w:rPr>
+                <w:sz w:val="24"/>
+              </w:rPr>
+            </w:pPr>
+          </w:p>
+          <w:p>
+            <w:pPr>
+              <w:spacing w:line="360" w:lineRule="auto"/>
+              <w:rPr>
+                <w:sz w:val="24"/>
+              </w:rPr>
+            </w:pPr>
+          </w:p>
+          <w:p>
+            <w:pPr>
+              <w:spacing w:line="360" w:lineRule="auto"/>
+              <w:rPr>
+                <w:sz w:val="24"/>
+              </w:rPr>
+            </w:pPr>
+          </w:p>
+          <w:p>
+            <w:pPr>
+              <w:spacing w:line="360" w:lineRule="auto"/>
+              <w:rPr>
+                <w:b/>
+                <w:sz w:val="24"/>
+              </w:rPr>
+            </w:pPr>
+            <w:r>
+              <w:rPr>
+                <w:rFonts w:hint="eastAsia"/>
+                <w:b/>
+                <w:sz w:val="24"/>
+              </w:rPr>
+              <w:t>3</w:t>
+            </w:r>
+            <w:r>
+              <w:rPr>
+                <w:rFonts w:hint="eastAsia"/>
+                <w:b/>
+                <w:sz w:val="24"/>
+              </w:rPr>
+              <w:t>．参赛成员信息及主要工作</w:t>
             </w:r>
           </w:p>
           <w:p>
@@ -771,19 +1332,165 @@
           <w:p>
             <w:pPr>
               <w:spacing w:line="360" w:lineRule="auto"/>
-              <w:ind w:firstLine="480" w:firstLineChars="200"/>
-              <w:rPr>
-                <w:color w:val="FF0000"/>
-                <w:sz w:val="24"/>
-              </w:rPr>
-            </w:pPr>
-            <w:r>
-              <w:rPr>
-                <w:rFonts w:hint="eastAsia"/>
-                <w:color w:val="FF0000"/>
-                <w:sz w:val="24"/>
-              </w:rPr>
-              <w:t>(1)张三，男，学号20120410，软件专业，三年级。曾参加过2011、2012两届六子棋比赛，分别获得一等奖(排名第2)、二等奖(排名第1)，也参加了2011的国际比赛，获季军。本人对程序所做的工作包括：算法设计、程序设计、程序测试等……。</w:t>
+              <w:ind w:firstLineChars="200" w:firstLine="480"/>
+              <w:rPr>
+                <w:color w:val="FF0000"/>
+                <w:sz w:val="24"/>
+              </w:rPr>
+            </w:pPr>
+            <w:r>
+              <w:rPr>
+                <w:rFonts w:hint="eastAsia"/>
+                <w:color w:val="FF0000"/>
+                <w:sz w:val="24"/>
+              </w:rPr>
+              <w:t>(1)</w:t>
+            </w:r>
+            <w:r>
+              <w:rPr>
+                <w:rFonts w:hint="eastAsia"/>
+                <w:color w:val="FF0000"/>
+                <w:sz w:val="24"/>
+              </w:rPr>
+              <w:t>张三，男，学号</w:t>
+            </w:r>
+            <w:r>
+              <w:rPr>
+                <w:rFonts w:hint="eastAsia"/>
+                <w:color w:val="FF0000"/>
+                <w:sz w:val="24"/>
+              </w:rPr>
+              <w:t>20120410</w:t>
+            </w:r>
+            <w:r>
+              <w:rPr>
+                <w:rFonts w:hint="eastAsia"/>
+                <w:color w:val="FF0000"/>
+                <w:sz w:val="24"/>
+              </w:rPr>
+              <w:t>，软件专业，三年级。曾参加过</w:t>
+            </w:r>
+            <w:r>
+              <w:rPr>
+                <w:rFonts w:hint="eastAsia"/>
+                <w:color w:val="FF0000"/>
+                <w:sz w:val="24"/>
+              </w:rPr>
+              <w:t>2011</w:t>
+            </w:r>
+            <w:r>
+              <w:rPr>
+                <w:rFonts w:hint="eastAsia"/>
+                <w:color w:val="FF0000"/>
+                <w:sz w:val="24"/>
+              </w:rPr>
+              <w:t>、</w:t>
+            </w:r>
+            <w:r>
+              <w:rPr>
+                <w:rFonts w:hint="eastAsia"/>
+                <w:color w:val="FF0000"/>
+                <w:sz w:val="24"/>
+              </w:rPr>
+              <w:t>2012</w:t>
+            </w:r>
+            <w:proofErr w:type="gramStart"/>
+            <w:r>
+              <w:rPr>
+                <w:rFonts w:hint="eastAsia"/>
+                <w:color w:val="FF0000"/>
+                <w:sz w:val="24"/>
+              </w:rPr>
+              <w:t>两</w:t>
+            </w:r>
+            <w:proofErr w:type="gramEnd"/>
+            <w:r>
+              <w:rPr>
+                <w:rFonts w:hint="eastAsia"/>
+                <w:color w:val="FF0000"/>
+                <w:sz w:val="24"/>
+              </w:rPr>
+              <w:t>届六子棋比赛，分别获得一等奖</w:t>
+            </w:r>
+            <w:r>
+              <w:rPr>
+                <w:rFonts w:hint="eastAsia"/>
+                <w:color w:val="FF0000"/>
+                <w:sz w:val="24"/>
+              </w:rPr>
+              <w:t>(</w:t>
+            </w:r>
+            <w:r>
+              <w:rPr>
+                <w:rFonts w:hint="eastAsia"/>
+                <w:color w:val="FF0000"/>
+                <w:sz w:val="24"/>
+              </w:rPr>
+              <w:t>排名第</w:t>
+            </w:r>
+            <w:r>
+              <w:rPr>
+                <w:rFonts w:hint="eastAsia"/>
+                <w:color w:val="FF0000"/>
+                <w:sz w:val="24"/>
+              </w:rPr>
+              <w:t>2)</w:t>
+            </w:r>
+            <w:r>
+              <w:rPr>
+                <w:rFonts w:hint="eastAsia"/>
+                <w:color w:val="FF0000"/>
+                <w:sz w:val="24"/>
+              </w:rPr>
+              <w:t>、二等奖</w:t>
+            </w:r>
+            <w:r>
+              <w:rPr>
+                <w:rFonts w:hint="eastAsia"/>
+                <w:color w:val="FF0000"/>
+                <w:sz w:val="24"/>
+              </w:rPr>
+              <w:t>(</w:t>
+            </w:r>
+            <w:r>
+              <w:rPr>
+                <w:rFonts w:hint="eastAsia"/>
+                <w:color w:val="FF0000"/>
+                <w:sz w:val="24"/>
+              </w:rPr>
+              <w:t>排名第</w:t>
+            </w:r>
+            <w:r>
+              <w:rPr>
+                <w:rFonts w:hint="eastAsia"/>
+                <w:color w:val="FF0000"/>
+                <w:sz w:val="24"/>
+              </w:rPr>
+              <w:t>1)</w:t>
+            </w:r>
+            <w:r>
+              <w:rPr>
+                <w:rFonts w:hint="eastAsia"/>
+                <w:color w:val="FF0000"/>
+                <w:sz w:val="24"/>
+              </w:rPr>
+              <w:t>，也参加了</w:t>
+            </w:r>
+            <w:r>
+              <w:rPr>
+                <w:rFonts w:hint="eastAsia"/>
+                <w:color w:val="FF0000"/>
+                <w:sz w:val="24"/>
+              </w:rPr>
+              <w:t>2011</w:t>
+            </w:r>
+            <w:r>
+              <w:rPr>
+                <w:rFonts w:hint="eastAsia"/>
+                <w:color w:val="FF0000"/>
+                <w:sz w:val="24"/>
+              </w:rPr>
+              <w:t>的国际比赛，获季军。本人对程序所做的工作包括：算法设计、程序设计、程序测试等……。</w:t>
             </w:r>
           </w:p>
           <w:p>
@@ -805,7 +1512,15 @@
                 <w:color w:val="FF0000"/>
                 <w:sz w:val="24"/>
               </w:rPr>
-              <w:t>(2)李四，……</w:t>
+              <w:t>(2)</w:t>
+            </w:r>
+            <w:r>
+              <w:rPr>
+                <w:rFonts w:hint="eastAsia"/>
+                <w:color w:val="FF0000"/>
+                <w:sz w:val="24"/>
+              </w:rPr>
+              <w:t>李四，……</w:t>
             </w:r>
           </w:p>
         </w:tc>
@@ -813,7 +1528,7 @@
     </w:tbl>
     <w:p>
       <w:pPr>
-        <w:spacing w:before="156" w:beforeLines="50"/>
+        <w:spacing w:beforeLines="50" w:before="156"/>
         <w:rPr>
           <w:b/>
           <w:sz w:val="28"/>
@@ -827,46 +1542,31 @@
           <w:sz w:val="28"/>
           <w:szCs w:val="28"/>
         </w:rPr>
+        <w:lastRenderedPageBreak/>
         <w:t>二、程序技术要点或创新性工作</w:t>
       </w:r>
     </w:p>
     <w:tbl>
       <w:tblPr>
-        <w:tblStyle w:val="4"/>
         <w:tblW w:w="8928" w:type="dxa"/>
         <w:tblInd w:w="-116" w:type="dxa"/>
         <w:tblBorders>
-          <w:top w:val="single" w:color="auto" w:sz="4" w:space="0"/>
-          <w:left w:val="single" w:color="auto" w:sz="4" w:space="0"/>
-          <w:bottom w:val="single" w:color="auto" w:sz="4" w:space="0"/>
-          <w:right w:val="single" w:color="auto" w:sz="4" w:space="0"/>
-          <w:insideH w:val="single" w:color="auto" w:sz="4" w:space="0"/>
-          <w:insideV w:val="single" w:color="auto" w:sz="4" w:space="0"/>
+          <w:top w:val="single" w:sz="4" w:space="0" w:color="auto"/>
+          <w:left w:val="single" w:sz="4" w:space="0" w:color="auto"/>
+          <w:bottom w:val="single" w:sz="4" w:space="0" w:color="auto"/>
+          <w:right w:val="single" w:sz="4" w:space="0" w:color="auto"/>
+          <w:insideH w:val="single" w:sz="4" w:space="0" w:color="auto"/>
+          <w:insideV w:val="single" w:sz="4" w:space="0" w:color="auto"/>
         </w:tblBorders>
         <w:tblLayout w:type="fixed"/>
-        <w:tblCellMar>
-          <w:top w:w="0" w:type="dxa"/>
-          <w:left w:w="108" w:type="dxa"/>
-          <w:bottom w:w="0" w:type="dxa"/>
-          <w:right w:w="108" w:type="dxa"/>
-        </w:tblCellMar>
+        <w:tblLook w:val="04A0" w:firstRow="1" w:lastRow="0" w:firstColumn="1" w:lastColumn="0" w:noHBand="0" w:noVBand="1"/>
       </w:tblPr>
       <w:tblGrid>
         <w:gridCol w:w="8928"/>
       </w:tblGrid>
       <w:tr>
-        <w:tblPrEx>
-          <w:tblBorders>
-            <w:top w:val="single" w:color="auto" w:sz="4" w:space="0"/>
-            <w:left w:val="single" w:color="auto" w:sz="4" w:space="0"/>
-            <w:bottom w:val="single" w:color="auto" w:sz="4" w:space="0"/>
-            <w:right w:val="single" w:color="auto" w:sz="4" w:space="0"/>
-            <w:insideH w:val="single" w:color="auto" w:sz="4" w:space="0"/>
-            <w:insideV w:val="single" w:color="auto" w:sz="4" w:space="0"/>
-          </w:tblBorders>
-        </w:tblPrEx>
         <w:trPr>
-          <w:trHeight w:val="7270" w:hRule="atLeast"/>
+          <w:trHeight w:val="7270"/>
         </w:trPr>
         <w:tc>
           <w:tcPr>
@@ -884,7 +1584,14 @@
                 <w:rFonts w:hint="eastAsia"/>
                 <w:szCs w:val="21"/>
               </w:rPr>
-              <w:t xml:space="preserve">可用文字或算法流程图描述相关技术要点和创新性工作。对于参考开源代码的程序，要特别描述在哪些方面有所改进或创新。 </w:t>
+              <w:t>可用文字或算法流程图描述相关技术要点和创新性工作。对于参考开源代码的程序，要特别描述在哪些方面有所改进或创新。</w:t>
+            </w:r>
+            <w:r>
+              <w:rPr>
+                <w:rFonts w:hint="eastAsia"/>
+                <w:szCs w:val="21"/>
+              </w:rPr>
+              <w:t xml:space="preserve"> </w:t>
             </w:r>
             <w:r>
               <w:rPr>
@@ -895,7 +1602,7 @@
             </w:r>
             <w:r>
               <w:rPr>
-                <w:rFonts w:hint="eastAsia" w:ascii="宋体" w:hAnsi="宋体"/>
+                <w:rFonts w:ascii="宋体" w:hAnsi="宋体" w:hint="eastAsia"/>
                 <w:sz w:val="24"/>
               </w:rPr>
               <w:t>≥4</w:t>
@@ -905,76 +1612,107 @@
                 <w:rFonts w:hint="eastAsia"/>
                 <w:sz w:val="24"/>
               </w:rPr>
-              <w:t>00字）</w:t>
-            </w:r>
-          </w:p>
-          <w:p>
-            <w:pPr>
-              <w:spacing w:line="360" w:lineRule="auto"/>
-              <w:rPr>
-                <w:color w:val="FF0000"/>
-                <w:sz w:val="24"/>
-              </w:rPr>
-            </w:pPr>
-            <w:r>
-              <w:rPr>
-                <w:rFonts w:hint="eastAsia"/>
-                <w:color w:val="FF0000"/>
-                <w:sz w:val="24"/>
-              </w:rPr>
-              <w:t>1．</w:t>
-            </w:r>
-          </w:p>
-          <w:p>
-            <w:pPr>
-              <w:spacing w:line="360" w:lineRule="auto"/>
-              <w:rPr>
-                <w:color w:val="FF0000"/>
-                <w:sz w:val="24"/>
-              </w:rPr>
-            </w:pPr>
-          </w:p>
-          <w:p>
-            <w:pPr>
-              <w:spacing w:line="360" w:lineRule="auto"/>
-              <w:rPr>
-                <w:color w:val="FF0000"/>
-                <w:sz w:val="24"/>
-              </w:rPr>
-            </w:pPr>
-            <w:r>
-              <w:rPr>
-                <w:rFonts w:hint="eastAsia"/>
-                <w:color w:val="FF0000"/>
-                <w:sz w:val="24"/>
-              </w:rPr>
-              <w:t>2．</w:t>
-            </w:r>
-          </w:p>
-          <w:p>
-            <w:pPr>
-              <w:spacing w:line="360" w:lineRule="auto"/>
-              <w:rPr>
-                <w:color w:val="FF0000"/>
-                <w:sz w:val="24"/>
-              </w:rPr>
-            </w:pPr>
-          </w:p>
-          <w:p>
-            <w:pPr>
-              <w:spacing w:line="360" w:lineRule="auto"/>
-              <w:rPr>
-                <w:color w:val="FF0000"/>
-                <w:sz w:val="24"/>
-              </w:rPr>
-            </w:pPr>
-            <w:r>
-              <w:rPr>
-                <w:rFonts w:hint="eastAsia"/>
-                <w:color w:val="FF0000"/>
-                <w:sz w:val="24"/>
-              </w:rPr>
-              <w:t>3．</w:t>
+              <w:t>00</w:t>
+            </w:r>
+            <w:r>
+              <w:rPr>
+                <w:rFonts w:hint="eastAsia"/>
+                <w:sz w:val="24"/>
+              </w:rPr>
+              <w:t>字）</w:t>
+            </w:r>
+          </w:p>
+          <w:p>
+            <w:pPr>
+              <w:spacing w:line="360" w:lineRule="auto"/>
+              <w:rPr>
+                <w:color w:val="FF0000"/>
+                <w:sz w:val="24"/>
+              </w:rPr>
+            </w:pPr>
+            <w:r>
+              <w:rPr>
+                <w:rFonts w:hint="eastAsia"/>
+                <w:color w:val="FF0000"/>
+                <w:sz w:val="24"/>
+              </w:rPr>
+              <w:t>1</w:t>
+            </w:r>
+            <w:r>
+              <w:rPr>
+                <w:rFonts w:hint="eastAsia"/>
+                <w:color w:val="FF0000"/>
+                <w:sz w:val="24"/>
+              </w:rPr>
+              <w:t>．</w:t>
+            </w:r>
+          </w:p>
+          <w:p>
+            <w:pPr>
+              <w:spacing w:line="360" w:lineRule="auto"/>
+              <w:rPr>
+                <w:color w:val="FF0000"/>
+                <w:sz w:val="24"/>
+              </w:rPr>
+            </w:pPr>
+          </w:p>
+          <w:p>
+            <w:pPr>
+              <w:spacing w:line="360" w:lineRule="auto"/>
+              <w:rPr>
+                <w:color w:val="FF0000"/>
+                <w:sz w:val="24"/>
+              </w:rPr>
+            </w:pPr>
+            <w:r>
+              <w:rPr>
+                <w:rFonts w:hint="eastAsia"/>
+                <w:color w:val="FF0000"/>
+                <w:sz w:val="24"/>
+              </w:rPr>
+              <w:t>2</w:t>
+            </w:r>
+            <w:r>
+              <w:rPr>
+                <w:rFonts w:hint="eastAsia"/>
+                <w:color w:val="FF0000"/>
+                <w:sz w:val="24"/>
+              </w:rPr>
+              <w:t>．</w:t>
+            </w:r>
+          </w:p>
+          <w:p>
+            <w:pPr>
+              <w:spacing w:line="360" w:lineRule="auto"/>
+              <w:rPr>
+                <w:color w:val="FF0000"/>
+                <w:sz w:val="24"/>
+              </w:rPr>
+            </w:pPr>
+          </w:p>
+          <w:p>
+            <w:pPr>
+              <w:spacing w:line="360" w:lineRule="auto"/>
+              <w:rPr>
+                <w:color w:val="FF0000"/>
+                <w:sz w:val="24"/>
+              </w:rPr>
+            </w:pPr>
+            <w:r>
+              <w:rPr>
+                <w:rFonts w:hint="eastAsia"/>
+                <w:color w:val="FF0000"/>
+                <w:sz w:val="24"/>
+              </w:rPr>
+              <w:t>3</w:t>
+            </w:r>
+            <w:r>
+              <w:rPr>
+                <w:rFonts w:hint="eastAsia"/>
+                <w:color w:val="FF0000"/>
+                <w:sz w:val="24"/>
+              </w:rPr>
+              <w:t>．</w:t>
             </w:r>
           </w:p>
           <w:p>
@@ -997,7 +1735,7 @@
     </w:tbl>
     <w:p>
       <w:pPr>
-        <w:spacing w:before="156" w:beforeLines="50"/>
+        <w:spacing w:beforeLines="50" w:before="156"/>
         <w:rPr>
           <w:b/>
           <w:sz w:val="28"/>
@@ -1011,46 +1749,48 @@
           <w:sz w:val="28"/>
           <w:szCs w:val="28"/>
         </w:rPr>
-        <w:t>三、关于AI辅助程序设计的说明</w:t>
+        <w:t>三、关于</w:t>
+      </w:r>
+      <w:r>
+        <w:rPr>
+          <w:rFonts w:hint="eastAsia"/>
+          <w:b/>
+          <w:sz w:val="28"/>
+          <w:szCs w:val="28"/>
+        </w:rPr>
+        <w:t>AI</w:t>
+      </w:r>
+      <w:r>
+        <w:rPr>
+          <w:rFonts w:hint="eastAsia"/>
+          <w:b/>
+          <w:sz w:val="28"/>
+          <w:szCs w:val="28"/>
+        </w:rPr>
+        <w:t>辅助程序设计的说明</w:t>
       </w:r>
     </w:p>
     <w:tbl>
       <w:tblPr>
-        <w:tblStyle w:val="4"/>
         <w:tblW w:w="0" w:type="auto"/>
         <w:tblInd w:w="-116" w:type="dxa"/>
         <w:tblBorders>
-          <w:top w:val="single" w:color="auto" w:sz="4" w:space="0"/>
-          <w:left w:val="single" w:color="auto" w:sz="4" w:space="0"/>
-          <w:bottom w:val="single" w:color="auto" w:sz="4" w:space="0"/>
-          <w:right w:val="single" w:color="auto" w:sz="4" w:space="0"/>
-          <w:insideH w:val="single" w:color="auto" w:sz="4" w:space="0"/>
-          <w:insideV w:val="single" w:color="auto" w:sz="4" w:space="0"/>
+          <w:top w:val="single" w:sz="4" w:space="0" w:color="auto"/>
+          <w:left w:val="single" w:sz="4" w:space="0" w:color="auto"/>
+          <w:bottom w:val="single" w:sz="4" w:space="0" w:color="auto"/>
+          <w:right w:val="single" w:sz="4" w:space="0" w:color="auto"/>
+          <w:insideH w:val="single" w:sz="4" w:space="0" w:color="auto"/>
+          <w:insideV w:val="single" w:sz="4" w:space="0" w:color="auto"/>
         </w:tblBorders>
         <w:tblLayout w:type="fixed"/>
-        <w:tblCellMar>
-          <w:top w:w="0" w:type="dxa"/>
-          <w:left w:w="108" w:type="dxa"/>
-          <w:bottom w:w="0" w:type="dxa"/>
-          <w:right w:w="108" w:type="dxa"/>
-        </w:tblCellMar>
+        <w:tblLook w:val="04A0" w:firstRow="1" w:lastRow="0" w:firstColumn="1" w:lastColumn="0" w:noHBand="0" w:noVBand="1"/>
       </w:tblPr>
       <w:tblGrid>
         <w:gridCol w:w="8928"/>
       </w:tblGrid>
       <w:tr>
-        <w:tblPrEx>
-          <w:tblBorders>
-            <w:top w:val="single" w:color="auto" w:sz="4" w:space="0"/>
-            <w:left w:val="single" w:color="auto" w:sz="4" w:space="0"/>
-            <w:bottom w:val="single" w:color="auto" w:sz="4" w:space="0"/>
-            <w:right w:val="single" w:color="auto" w:sz="4" w:space="0"/>
-            <w:insideH w:val="single" w:color="auto" w:sz="4" w:space="0"/>
-            <w:insideV w:val="single" w:color="auto" w:sz="4" w:space="0"/>
-          </w:tblBorders>
-        </w:tblPrEx>
         <w:trPr>
-          <w:trHeight w:val="4810" w:hRule="atLeast"/>
+          <w:trHeight w:val="4810"/>
         </w:trPr>
         <w:tc>
           <w:tcPr>
@@ -1068,66 +1808,102 @@
                 <w:rFonts w:hint="eastAsia"/>
                 <w:szCs w:val="21"/>
               </w:rPr>
-              <w:t xml:space="preserve">请说明程序哪些部分借助AI生成，个人的工作量主要体现在哪些方面？ </w:t>
-            </w:r>
-          </w:p>
-          <w:p>
-            <w:pPr>
-              <w:spacing w:line="360" w:lineRule="auto"/>
-              <w:rPr>
-                <w:color w:val="FF0000"/>
-                <w:sz w:val="24"/>
-              </w:rPr>
-            </w:pPr>
-            <w:r>
-              <w:rPr>
-                <w:rFonts w:hint="eastAsia"/>
-                <w:color w:val="FF0000"/>
-                <w:sz w:val="24"/>
-              </w:rPr>
-              <w:t>1．</w:t>
-            </w:r>
-          </w:p>
-          <w:p>
-            <w:pPr>
-              <w:spacing w:line="360" w:lineRule="auto"/>
-              <w:rPr>
-                <w:color w:val="FF0000"/>
-                <w:sz w:val="24"/>
-              </w:rPr>
-            </w:pPr>
-          </w:p>
-          <w:p>
-            <w:pPr>
-              <w:spacing w:line="360" w:lineRule="auto"/>
-              <w:rPr>
-                <w:color w:val="FF0000"/>
-                <w:sz w:val="24"/>
-              </w:rPr>
-            </w:pPr>
-            <w:r>
-              <w:rPr>
-                <w:rFonts w:hint="eastAsia"/>
-                <w:color w:val="FF0000"/>
-                <w:sz w:val="24"/>
-              </w:rPr>
-              <w:t>2．</w:t>
-            </w:r>
-          </w:p>
-          <w:p>
-            <w:pPr>
-              <w:spacing w:line="360" w:lineRule="auto"/>
-              <w:rPr>
-                <w:color w:val="FF0000"/>
-                <w:sz w:val="24"/>
-              </w:rPr>
-            </w:pPr>
-          </w:p>
-          <w:p>
-            <w:pPr>
-              <w:spacing w:line="360" w:lineRule="auto"/>
-              <w:rPr>
-                <w:rFonts w:hint="eastAsia"/>
+              <w:t>请说明程序哪些部分借助</w:t>
+            </w:r>
+            <w:r>
+              <w:rPr>
+                <w:rFonts w:hint="eastAsia"/>
+                <w:szCs w:val="21"/>
+              </w:rPr>
+              <w:t>AI</w:t>
+            </w:r>
+            <w:r>
+              <w:rPr>
+                <w:rFonts w:hint="eastAsia"/>
+                <w:szCs w:val="21"/>
+              </w:rPr>
+              <w:t>生成，个人的工作量主要体现在哪些方面？</w:t>
+            </w:r>
+            <w:r>
+              <w:rPr>
+                <w:rFonts w:hint="eastAsia"/>
+                <w:szCs w:val="21"/>
+              </w:rPr>
+              <w:t xml:space="preserve"> </w:t>
+            </w:r>
+          </w:p>
+          <w:p>
+            <w:pPr>
+              <w:spacing w:line="360" w:lineRule="auto"/>
+              <w:rPr>
+                <w:color w:val="FF0000"/>
+                <w:sz w:val="24"/>
+              </w:rPr>
+            </w:pPr>
+            <w:r>
+              <w:rPr>
+                <w:rFonts w:hint="eastAsia"/>
+                <w:color w:val="FF0000"/>
+                <w:sz w:val="24"/>
+              </w:rPr>
+              <w:t>1</w:t>
+            </w:r>
+            <w:r>
+              <w:rPr>
+                <w:rFonts w:hint="eastAsia"/>
+                <w:color w:val="FF0000"/>
+                <w:sz w:val="24"/>
+              </w:rPr>
+              <w:t>．</w:t>
+            </w:r>
+          </w:p>
+          <w:p>
+            <w:pPr>
+              <w:spacing w:line="360" w:lineRule="auto"/>
+              <w:rPr>
+                <w:color w:val="FF0000"/>
+                <w:sz w:val="24"/>
+              </w:rPr>
+            </w:pPr>
+          </w:p>
+          <w:p>
+            <w:pPr>
+              <w:spacing w:line="360" w:lineRule="auto"/>
+              <w:rPr>
+                <w:color w:val="FF0000"/>
+                <w:sz w:val="24"/>
+              </w:rPr>
+            </w:pPr>
+            <w:r>
+              <w:rPr>
+                <w:rFonts w:hint="eastAsia"/>
+                <w:color w:val="FF0000"/>
+                <w:sz w:val="24"/>
+              </w:rPr>
+              <w:t>2</w:t>
+            </w:r>
+            <w:r>
+              <w:rPr>
+                <w:rFonts w:hint="eastAsia"/>
+                <w:color w:val="FF0000"/>
+                <w:sz w:val="24"/>
+              </w:rPr>
+              <w:t>．</w:t>
+            </w:r>
+          </w:p>
+          <w:p>
+            <w:pPr>
+              <w:spacing w:line="360" w:lineRule="auto"/>
+              <w:rPr>
+                <w:color w:val="FF0000"/>
+                <w:sz w:val="24"/>
+              </w:rPr>
+            </w:pPr>
+          </w:p>
+          <w:p>
+            <w:pPr>
+              <w:spacing w:line="360" w:lineRule="auto"/>
+              <w:rPr>
                 <w:color w:val="FF0000"/>
                 <w:sz w:val="24"/>
               </w:rPr>
@@ -1138,8 +1914,8 @@
     </w:tbl>
     <w:p>
       <w:pPr>
-        <w:spacing w:before="156" w:beforeLines="50"/>
-        <w:ind w:left="360" w:hanging="359" w:hangingChars="128"/>
+        <w:spacing w:beforeLines="50" w:before="156"/>
+        <w:ind w:left="360" w:hangingChars="128" w:hanging="360"/>
         <w:rPr>
           <w:b/>
           <w:sz w:val="28"/>
@@ -1153,46 +1929,31 @@
           <w:sz w:val="28"/>
           <w:szCs w:val="28"/>
         </w:rPr>
+        <w:lastRenderedPageBreak/>
         <w:t>四、程序参考文献</w:t>
       </w:r>
     </w:p>
     <w:tbl>
       <w:tblPr>
-        <w:tblStyle w:val="4"/>
         <w:tblW w:w="0" w:type="auto"/>
         <w:tblInd w:w="-116" w:type="dxa"/>
         <w:tblBorders>
-          <w:top w:val="single" w:color="auto" w:sz="4" w:space="0"/>
-          <w:left w:val="single" w:color="auto" w:sz="4" w:space="0"/>
-          <w:bottom w:val="single" w:color="auto" w:sz="4" w:space="0"/>
-          <w:right w:val="single" w:color="auto" w:sz="4" w:space="0"/>
-          <w:insideH w:val="single" w:color="auto" w:sz="4" w:space="0"/>
-          <w:insideV w:val="single" w:color="auto" w:sz="4" w:space="0"/>
+          <w:top w:val="single" w:sz="4" w:space="0" w:color="auto"/>
+          <w:left w:val="single" w:sz="4" w:space="0" w:color="auto"/>
+          <w:bottom w:val="single" w:sz="4" w:space="0" w:color="auto"/>
+          <w:right w:val="single" w:sz="4" w:space="0" w:color="auto"/>
+          <w:insideH w:val="single" w:sz="4" w:space="0" w:color="auto"/>
+          <w:insideV w:val="single" w:sz="4" w:space="0" w:color="auto"/>
         </w:tblBorders>
         <w:tblLayout w:type="fixed"/>
-        <w:tblCellMar>
-          <w:top w:w="0" w:type="dxa"/>
-          <w:left w:w="108" w:type="dxa"/>
-          <w:bottom w:w="0" w:type="dxa"/>
-          <w:right w:w="108" w:type="dxa"/>
-        </w:tblCellMar>
+        <w:tblLook w:val="04A0" w:firstRow="1" w:lastRow="0" w:firstColumn="1" w:lastColumn="0" w:noHBand="0" w:noVBand="1"/>
       </w:tblPr>
       <w:tblGrid>
         <w:gridCol w:w="8928"/>
       </w:tblGrid>
       <w:tr>
-        <w:tblPrEx>
-          <w:tblBorders>
-            <w:top w:val="single" w:color="auto" w:sz="4" w:space="0"/>
-            <w:left w:val="single" w:color="auto" w:sz="4" w:space="0"/>
-            <w:bottom w:val="single" w:color="auto" w:sz="4" w:space="0"/>
-            <w:right w:val="single" w:color="auto" w:sz="4" w:space="0"/>
-            <w:insideH w:val="single" w:color="auto" w:sz="4" w:space="0"/>
-            <w:insideV w:val="single" w:color="auto" w:sz="4" w:space="0"/>
-          </w:tblBorders>
-        </w:tblPrEx>
         <w:trPr>
-          <w:trHeight w:val="4656" w:hRule="atLeast"/>
+          <w:trHeight w:val="4656"/>
         </w:trPr>
         <w:tc>
           <w:tcPr>
@@ -1312,7 +2073,16 @@
                 <w:sz w:val="24"/>
                 <w:lang w:val="de-DE"/>
               </w:rPr>
-              <w:t>徐心和,</w:t>
+              <w:t>徐心和</w:t>
+            </w:r>
+            <w:r>
+              <w:rPr>
+                <w:rFonts w:hint="eastAsia"/>
+                <w:color w:val="FF0000"/>
+                <w:sz w:val="24"/>
+                <w:lang w:val="de-DE"/>
+              </w:rPr>
+              <w:t>,</w:t>
             </w:r>
             <w:r>
               <w:rPr>
@@ -1329,7 +2099,16 @@
                 <w:sz w:val="24"/>
                 <w:lang w:val="de-DE"/>
               </w:rPr>
-              <w:t>邓志力等.</w:t>
+              <w:t>邓志力等</w:t>
+            </w:r>
+            <w:r>
+              <w:rPr>
+                <w:rFonts w:hint="eastAsia"/>
+                <w:color w:val="FF0000"/>
+                <w:sz w:val="24"/>
+                <w:lang w:val="de-DE"/>
+              </w:rPr>
+              <w:t>.</w:t>
             </w:r>
             <w:r>
               <w:rPr>
@@ -1346,7 +2125,43 @@
                 <w:sz w:val="24"/>
                 <w:lang w:val="de-DE"/>
               </w:rPr>
-              <w:t>机器博弈研究面临的各种挑战[J]，智能系统学报，2008，</w:t>
+              <w:t>机器博弈研究面临的各种挑战</w:t>
+            </w:r>
+            <w:r>
+              <w:rPr>
+                <w:rFonts w:hint="eastAsia"/>
+                <w:color w:val="FF0000"/>
+                <w:sz w:val="24"/>
+                <w:lang w:val="de-DE"/>
+              </w:rPr>
+              <w:t>[J]</w:t>
+            </w:r>
+            <w:r>
+              <w:rPr>
+                <w:rFonts w:hint="eastAsia"/>
+                <w:color w:val="FF0000"/>
+                <w:sz w:val="24"/>
+                <w:lang w:val="de-DE"/>
+              </w:rPr>
+              <w:t>，智能系统学报，</w:t>
+            </w:r>
+            <w:r>
+              <w:rPr>
+                <w:rFonts w:hint="eastAsia"/>
+                <w:color w:val="FF0000"/>
+                <w:sz w:val="24"/>
+                <w:lang w:val="de-DE"/>
+              </w:rPr>
+              <w:t>2008</w:t>
+            </w:r>
+            <w:r>
+              <w:rPr>
+                <w:rFonts w:hint="eastAsia"/>
+                <w:color w:val="FF0000"/>
+                <w:sz w:val="24"/>
+                <w:lang w:val="de-DE"/>
+              </w:rPr>
+              <w:t>，</w:t>
             </w:r>
             <w:r>
               <w:rPr>
@@ -1363,17 +2178,53 @@
                 <w:sz w:val="24"/>
                 <w:lang w:val="de-DE"/>
               </w:rPr>
-              <w:t>3（4）：288-293.</w:t>
-            </w:r>
-          </w:p>
-          <w:p>
-            <w:pPr>
-              <w:spacing w:line="360" w:lineRule="auto"/>
-              <w:rPr>
+              <w:t>3</w:t>
+            </w:r>
+            <w:r>
+              <w:rPr>
+                <w:rFonts w:hint="eastAsia"/>
                 <w:color w:val="FF0000"/>
                 <w:sz w:val="24"/>
                 <w:lang w:val="de-DE"/>
               </w:rPr>
+              <w:t>（</w:t>
+            </w:r>
+            <w:r>
+              <w:rPr>
+                <w:rFonts w:hint="eastAsia"/>
+                <w:color w:val="FF0000"/>
+                <w:sz w:val="24"/>
+                <w:lang w:val="de-DE"/>
+              </w:rPr>
+              <w:t>4</w:t>
+            </w:r>
+            <w:r>
+              <w:rPr>
+                <w:rFonts w:hint="eastAsia"/>
+                <w:color w:val="FF0000"/>
+                <w:sz w:val="24"/>
+                <w:lang w:val="de-DE"/>
+              </w:rPr>
+              <w:t>）：</w:t>
+            </w:r>
+            <w:r>
+              <w:rPr>
+                <w:rFonts w:hint="eastAsia"/>
+                <w:color w:val="FF0000"/>
+                <w:sz w:val="24"/>
+                <w:lang w:val="de-DE"/>
+              </w:rPr>
+              <w:t>288-293.</w:t>
+            </w:r>
+          </w:p>
+          <w:p>
+            <w:pPr>
+              <w:spacing w:line="360" w:lineRule="auto"/>
+              <w:rPr>
+                <w:color w:val="FF0000"/>
+                <w:sz w:val="24"/>
+                <w:lang w:val="de-DE"/>
+              </w:rPr>
             </w:pPr>
             <w:r>
               <w:rPr>
@@ -1390,7 +2241,142 @@
                 <w:sz w:val="24"/>
                 <w:lang w:val="de-DE"/>
               </w:rPr>
-              <w:t>徐心和, 王艳, 刘纪红, 张雪峰. 博弈论的里程碑成果与局限性分析[A]，中国控制与决策会议[C]，2008：1214-1219.</w:t>
+              <w:t>徐心和</w:t>
+            </w:r>
+            <w:r>
+              <w:rPr>
+                <w:rFonts w:hint="eastAsia"/>
+                <w:color w:val="FF0000"/>
+                <w:sz w:val="24"/>
+                <w:lang w:val="de-DE"/>
+              </w:rPr>
+              <w:t xml:space="preserve">, </w:t>
+            </w:r>
+            <w:r>
+              <w:rPr>
+                <w:rFonts w:hint="eastAsia"/>
+                <w:color w:val="FF0000"/>
+                <w:sz w:val="24"/>
+                <w:lang w:val="de-DE"/>
+              </w:rPr>
+              <w:t>王艳</w:t>
+            </w:r>
+            <w:r>
+              <w:rPr>
+                <w:rFonts w:hint="eastAsia"/>
+                <w:color w:val="FF0000"/>
+                <w:sz w:val="24"/>
+                <w:lang w:val="de-DE"/>
+              </w:rPr>
+              <w:t xml:space="preserve">, </w:t>
+            </w:r>
+            <w:r>
+              <w:rPr>
+                <w:rFonts w:hint="eastAsia"/>
+                <w:color w:val="FF0000"/>
+                <w:sz w:val="24"/>
+                <w:lang w:val="de-DE"/>
+              </w:rPr>
+              <w:t>刘纪红</w:t>
+            </w:r>
+            <w:r>
+              <w:rPr>
+                <w:rFonts w:hint="eastAsia"/>
+                <w:color w:val="FF0000"/>
+                <w:sz w:val="24"/>
+                <w:lang w:val="de-DE"/>
+              </w:rPr>
+              <w:t xml:space="preserve">, </w:t>
+            </w:r>
+            <w:r>
+              <w:rPr>
+                <w:rFonts w:hint="eastAsia"/>
+                <w:color w:val="FF0000"/>
+                <w:sz w:val="24"/>
+                <w:lang w:val="de-DE"/>
+              </w:rPr>
+              <w:t>张雪峰</w:t>
+            </w:r>
+            <w:r>
+              <w:rPr>
+                <w:rFonts w:hint="eastAsia"/>
+                <w:color w:val="FF0000"/>
+                <w:sz w:val="24"/>
+                <w:lang w:val="de-DE"/>
+              </w:rPr>
+              <w:t xml:space="preserve">. </w:t>
+            </w:r>
+            <w:r>
+              <w:rPr>
+                <w:rFonts w:hint="eastAsia"/>
+                <w:color w:val="FF0000"/>
+                <w:sz w:val="24"/>
+                <w:lang w:val="de-DE"/>
+              </w:rPr>
+              <w:t>博弈论的里程碑成果与局限性分析</w:t>
+            </w:r>
+            <w:r>
+              <w:rPr>
+                <w:rFonts w:hint="eastAsia"/>
+                <w:color w:val="FF0000"/>
+                <w:sz w:val="24"/>
+                <w:lang w:val="de-DE"/>
+              </w:rPr>
+              <w:t>[A]</w:t>
+            </w:r>
+            <w:r>
+              <w:rPr>
+                <w:rFonts w:hint="eastAsia"/>
+                <w:color w:val="FF0000"/>
+                <w:sz w:val="24"/>
+                <w:lang w:val="de-DE"/>
+              </w:rPr>
+              <w:t>，中国控制与决策会议</w:t>
+            </w:r>
+            <w:r>
+              <w:rPr>
+                <w:rFonts w:hint="eastAsia"/>
+                <w:color w:val="FF0000"/>
+                <w:sz w:val="24"/>
+                <w:lang w:val="de-DE"/>
+              </w:rPr>
+              <w:t>[C]</w:t>
+            </w:r>
+            <w:r>
+              <w:rPr>
+                <w:rFonts w:hint="eastAsia"/>
+                <w:color w:val="FF0000"/>
+                <w:sz w:val="24"/>
+                <w:lang w:val="de-DE"/>
+              </w:rPr>
+              <w:t>，</w:t>
+            </w:r>
+            <w:r>
+              <w:rPr>
+                <w:rFonts w:hint="eastAsia"/>
+                <w:color w:val="FF0000"/>
+                <w:sz w:val="24"/>
+                <w:lang w:val="de-DE"/>
+              </w:rPr>
+              <w:t>2008</w:t>
+            </w:r>
+            <w:r>
+              <w:rPr>
+                <w:rFonts w:hint="eastAsia"/>
+                <w:color w:val="FF0000"/>
+                <w:sz w:val="24"/>
+                <w:lang w:val="de-DE"/>
+              </w:rPr>
+              <w:t>：</w:t>
+            </w:r>
+            <w:r>
+              <w:rPr>
+                <w:rFonts w:hint="eastAsia"/>
+                <w:color w:val="FF0000"/>
+                <w:sz w:val="24"/>
+                <w:lang w:val="de-DE"/>
+              </w:rPr>
+              <w:t>1214-1219.</w:t>
             </w:r>
           </w:p>
           <w:p>
@@ -1447,7 +2433,7 @@
     </w:tbl>
     <w:p>
       <w:pPr>
-        <w:spacing w:before="156" w:beforeLines="50"/>
+        <w:spacing w:beforeLines="50" w:before="156"/>
         <w:rPr>
           <w:b/>
           <w:sz w:val="28"/>
@@ -1467,6 +2453,7 @@
           <w:sz w:val="32"/>
           <w:szCs w:val="32"/>
         </w:rPr>
+        <w:lastRenderedPageBreak/>
         <w:t>五</w:t>
       </w:r>
       <w:r>
@@ -1490,41 +2477,25 @@
     </w:p>
     <w:tbl>
       <w:tblPr>
-        <w:tblStyle w:val="4"/>
         <w:tblW w:w="0" w:type="auto"/>
         <w:tblInd w:w="-116" w:type="dxa"/>
         <w:tblBorders>
-          <w:top w:val="single" w:color="auto" w:sz="4" w:space="0"/>
-          <w:left w:val="single" w:color="auto" w:sz="4" w:space="0"/>
-          <w:bottom w:val="single" w:color="auto" w:sz="4" w:space="0"/>
-          <w:right w:val="single" w:color="auto" w:sz="4" w:space="0"/>
-          <w:insideH w:val="single" w:color="auto" w:sz="4" w:space="0"/>
-          <w:insideV w:val="single" w:color="auto" w:sz="4" w:space="0"/>
+          <w:top w:val="single" w:sz="4" w:space="0" w:color="auto"/>
+          <w:left w:val="single" w:sz="4" w:space="0" w:color="auto"/>
+          <w:bottom w:val="single" w:sz="4" w:space="0" w:color="auto"/>
+          <w:right w:val="single" w:sz="4" w:space="0" w:color="auto"/>
+          <w:insideH w:val="single" w:sz="4" w:space="0" w:color="auto"/>
+          <w:insideV w:val="single" w:sz="4" w:space="0" w:color="auto"/>
         </w:tblBorders>
         <w:tblLayout w:type="fixed"/>
-        <w:tblCellMar>
-          <w:top w:w="0" w:type="dxa"/>
-          <w:left w:w="108" w:type="dxa"/>
-          <w:bottom w:w="0" w:type="dxa"/>
-          <w:right w:w="108" w:type="dxa"/>
-        </w:tblCellMar>
+        <w:tblLook w:val="04A0" w:firstRow="1" w:lastRow="0" w:firstColumn="1" w:lastColumn="0" w:noHBand="0" w:noVBand="1"/>
       </w:tblPr>
       <w:tblGrid>
         <w:gridCol w:w="8928"/>
       </w:tblGrid>
       <w:tr>
-        <w:tblPrEx>
-          <w:tblBorders>
-            <w:top w:val="single" w:color="auto" w:sz="4" w:space="0"/>
-            <w:left w:val="single" w:color="auto" w:sz="4" w:space="0"/>
-            <w:bottom w:val="single" w:color="auto" w:sz="4" w:space="0"/>
-            <w:right w:val="single" w:color="auto" w:sz="4" w:space="0"/>
-            <w:insideH w:val="single" w:color="auto" w:sz="4" w:space="0"/>
-            <w:insideV w:val="single" w:color="auto" w:sz="4" w:space="0"/>
-          </w:tblBorders>
-        </w:tblPrEx>
         <w:trPr>
-          <w:trHeight w:val="5762" w:hRule="atLeast"/>
+          <w:trHeight w:val="5762"/>
         </w:trPr>
         <w:tc>
           <w:tcPr>
@@ -1619,26 +2590,96 @@
           <w:p>
             <w:pPr>
               <w:spacing w:line="360" w:lineRule="auto"/>
-              <w:ind w:firstLine="2760" w:firstLineChars="1150"/>
-              <w:rPr>
-                <w:sz w:val="24"/>
-              </w:rPr>
-            </w:pPr>
-          </w:p>
-          <w:p>
-            <w:pPr>
-              <w:spacing w:line="360" w:lineRule="auto"/>
-              <w:ind w:firstLine="2760" w:firstLineChars="1150"/>
-              <w:rPr>
-                <w:sz w:val="24"/>
-              </w:rPr>
-            </w:pPr>
-            <w:r>
-              <w:rPr>
-                <w:rFonts w:hint="eastAsia"/>
-                <w:sz w:val="24"/>
-              </w:rPr>
-              <w:t>指导教师(签名)：             年     月     日</w:t>
+              <w:ind w:firstLineChars="1150" w:firstLine="2760"/>
+              <w:rPr>
+                <w:sz w:val="24"/>
+              </w:rPr>
+            </w:pPr>
+          </w:p>
+          <w:p>
+            <w:pPr>
+              <w:spacing w:line="360" w:lineRule="auto"/>
+              <w:ind w:firstLineChars="1150" w:firstLine="2760"/>
+              <w:rPr>
+                <w:sz w:val="24"/>
+              </w:rPr>
+            </w:pPr>
+            <w:r>
+              <w:rPr>
+                <w:rFonts w:hint="eastAsia"/>
+                <w:sz w:val="24"/>
+              </w:rPr>
+              <w:t>指导教师</w:t>
+            </w:r>
+            <w:r>
+              <w:rPr>
+                <w:rFonts w:hint="eastAsia"/>
+                <w:sz w:val="24"/>
+              </w:rPr>
+              <w:t>(</w:t>
+            </w:r>
+            <w:r>
+              <w:rPr>
+                <w:rFonts w:hint="eastAsia"/>
+                <w:sz w:val="24"/>
+              </w:rPr>
+              <w:t>签名</w:t>
+            </w:r>
+            <w:r>
+              <w:rPr>
+                <w:rFonts w:hint="eastAsia"/>
+                <w:sz w:val="24"/>
+              </w:rPr>
+              <w:t>)</w:t>
+            </w:r>
+            <w:r>
+              <w:rPr>
+                <w:rFonts w:hint="eastAsia"/>
+                <w:sz w:val="24"/>
+              </w:rPr>
+              <w:t>：</w:t>
+            </w:r>
+            <w:r>
+              <w:rPr>
+                <w:rFonts w:hint="eastAsia"/>
+                <w:sz w:val="24"/>
+              </w:rPr>
+              <w:t xml:space="preserve">             </w:t>
+            </w:r>
+            <w:r>
+              <w:rPr>
+                <w:rFonts w:hint="eastAsia"/>
+                <w:sz w:val="24"/>
+              </w:rPr>
+              <w:t>年</w:t>
+            </w:r>
+            <w:r>
+              <w:rPr>
+                <w:rFonts w:hint="eastAsia"/>
+                <w:sz w:val="24"/>
+              </w:rPr>
+              <w:t xml:space="preserve">     </w:t>
+            </w:r>
+            <w:r>
+              <w:rPr>
+                <w:rFonts w:hint="eastAsia"/>
+                <w:sz w:val="24"/>
+              </w:rPr>
+              <w:t>月</w:t>
+            </w:r>
+            <w:r>
+              <w:rPr>
+                <w:rFonts w:hint="eastAsia"/>
+                <w:sz w:val="24"/>
+              </w:rPr>
+              <w:t xml:space="preserve">     </w:t>
+            </w:r>
+            <w:r>
+              <w:rPr>
+                <w:rFonts w:hint="eastAsia"/>
+                <w:sz w:val="24"/>
+              </w:rPr>
+              <w:t>日</w:t>
             </w:r>
           </w:p>
         </w:tc>
@@ -1646,7 +2687,7 @@
     </w:tbl>
     <w:p>
       <w:pPr>
-        <w:spacing w:before="156" w:beforeLines="50"/>
+        <w:spacing w:beforeLines="50" w:before="156"/>
         <w:rPr>
           <w:b/>
           <w:sz w:val="28"/>
@@ -1665,41 +2706,25 @@
     </w:p>
     <w:tbl>
       <w:tblPr>
-        <w:tblStyle w:val="4"/>
         <w:tblW w:w="0" w:type="auto"/>
         <w:tblInd w:w="-116" w:type="dxa"/>
         <w:tblBorders>
-          <w:top w:val="single" w:color="auto" w:sz="4" w:space="0"/>
-          <w:left w:val="single" w:color="auto" w:sz="4" w:space="0"/>
-          <w:bottom w:val="single" w:color="auto" w:sz="4" w:space="0"/>
-          <w:right w:val="single" w:color="auto" w:sz="4" w:space="0"/>
-          <w:insideH w:val="single" w:color="auto" w:sz="4" w:space="0"/>
-          <w:insideV w:val="single" w:color="auto" w:sz="4" w:space="0"/>
+          <w:top w:val="single" w:sz="4" w:space="0" w:color="auto"/>
+          <w:left w:val="single" w:sz="4" w:space="0" w:color="auto"/>
+          <w:bottom w:val="single" w:sz="4" w:space="0" w:color="auto"/>
+          <w:right w:val="single" w:sz="4" w:space="0" w:color="auto"/>
+          <w:insideH w:val="single" w:sz="4" w:space="0" w:color="auto"/>
+          <w:insideV w:val="single" w:sz="4" w:space="0" w:color="auto"/>
         </w:tblBorders>
         <w:tblLayout w:type="fixed"/>
-        <w:tblCellMar>
-          <w:top w:w="0" w:type="dxa"/>
-          <w:left w:w="108" w:type="dxa"/>
-          <w:bottom w:w="0" w:type="dxa"/>
-          <w:right w:w="108" w:type="dxa"/>
-        </w:tblCellMar>
+        <w:tblLook w:val="04A0" w:firstRow="1" w:lastRow="0" w:firstColumn="1" w:lastColumn="0" w:noHBand="0" w:noVBand="1"/>
       </w:tblPr>
       <w:tblGrid>
         <w:gridCol w:w="8928"/>
       </w:tblGrid>
       <w:tr>
-        <w:tblPrEx>
-          <w:tblBorders>
-            <w:top w:val="single" w:color="auto" w:sz="4" w:space="0"/>
-            <w:left w:val="single" w:color="auto" w:sz="4" w:space="0"/>
-            <w:bottom w:val="single" w:color="auto" w:sz="4" w:space="0"/>
-            <w:right w:val="single" w:color="auto" w:sz="4" w:space="0"/>
-            <w:insideH w:val="single" w:color="auto" w:sz="4" w:space="0"/>
-            <w:insideV w:val="single" w:color="auto" w:sz="4" w:space="0"/>
-          </w:tblBorders>
-        </w:tblPrEx>
         <w:trPr>
-          <w:trHeight w:val="5954" w:hRule="atLeast"/>
+          <w:trHeight w:val="5954"/>
         </w:trPr>
         <w:tc>
           <w:tcPr>
@@ -1780,349 +2805,537 @@
           <w:p>
             <w:pPr>
               <w:spacing w:line="360" w:lineRule="auto"/>
-              <w:ind w:firstLine="1800" w:firstLineChars="750"/>
-              <w:rPr>
-                <w:sz w:val="24"/>
-              </w:rPr>
-            </w:pPr>
-            <w:r>
-              <w:rPr>
-                <w:rFonts w:hint="eastAsia"/>
-                <w:sz w:val="24"/>
-              </w:rPr>
-              <w:t xml:space="preserve">专家评委(签名)：         </w:t>
-            </w:r>
-          </w:p>
-          <w:p>
-            <w:pPr>
-              <w:spacing w:line="360" w:lineRule="auto"/>
-              <w:ind w:firstLine="1800" w:firstLineChars="750"/>
-              <w:rPr>
-                <w:sz w:val="24"/>
-              </w:rPr>
-            </w:pPr>
-          </w:p>
-          <w:p>
-            <w:pPr>
-              <w:spacing w:line="360" w:lineRule="auto"/>
-              <w:ind w:firstLine="5520" w:firstLineChars="2300"/>
-              <w:rPr>
-                <w:sz w:val="24"/>
-              </w:rPr>
-            </w:pPr>
-            <w:r>
-              <w:rPr>
-                <w:rFonts w:hint="eastAsia"/>
-                <w:sz w:val="24"/>
-              </w:rPr>
-              <w:t>年     月     日</w:t>
+              <w:ind w:firstLineChars="750" w:firstLine="1800"/>
+              <w:rPr>
+                <w:sz w:val="24"/>
+              </w:rPr>
+            </w:pPr>
+            <w:r>
+              <w:rPr>
+                <w:rFonts w:hint="eastAsia"/>
+                <w:sz w:val="24"/>
+              </w:rPr>
+              <w:t>专家评委</w:t>
+            </w:r>
+            <w:r>
+              <w:rPr>
+                <w:rFonts w:hint="eastAsia"/>
+                <w:sz w:val="24"/>
+              </w:rPr>
+              <w:t>(</w:t>
+            </w:r>
+            <w:r>
+              <w:rPr>
+                <w:rFonts w:hint="eastAsia"/>
+                <w:sz w:val="24"/>
+              </w:rPr>
+              <w:t>签名</w:t>
+            </w:r>
+            <w:r>
+              <w:rPr>
+                <w:rFonts w:hint="eastAsia"/>
+                <w:sz w:val="24"/>
+              </w:rPr>
+              <w:t>)</w:t>
+            </w:r>
+            <w:r>
+              <w:rPr>
+                <w:rFonts w:hint="eastAsia"/>
+                <w:sz w:val="24"/>
+              </w:rPr>
+              <w:t>：</w:t>
+            </w:r>
+            <w:r>
+              <w:rPr>
+                <w:rFonts w:hint="eastAsia"/>
+                <w:sz w:val="24"/>
+              </w:rPr>
+              <w:t xml:space="preserve">         </w:t>
+            </w:r>
+          </w:p>
+          <w:p>
+            <w:pPr>
+              <w:spacing w:line="360" w:lineRule="auto"/>
+              <w:ind w:firstLineChars="750" w:firstLine="1800"/>
+              <w:rPr>
+                <w:sz w:val="24"/>
+              </w:rPr>
+            </w:pPr>
+          </w:p>
+          <w:p>
+            <w:pPr>
+              <w:spacing w:line="360" w:lineRule="auto"/>
+              <w:ind w:firstLineChars="2300" w:firstLine="5520"/>
+              <w:rPr>
+                <w:sz w:val="24"/>
+              </w:rPr>
+            </w:pPr>
+            <w:r>
+              <w:rPr>
+                <w:rFonts w:hint="eastAsia"/>
+                <w:sz w:val="24"/>
+              </w:rPr>
+              <w:t>年</w:t>
+            </w:r>
+            <w:r>
+              <w:rPr>
+                <w:rFonts w:hint="eastAsia"/>
+                <w:sz w:val="24"/>
+              </w:rPr>
+              <w:t xml:space="preserve">     </w:t>
+            </w:r>
+            <w:r>
+              <w:rPr>
+                <w:rFonts w:hint="eastAsia"/>
+                <w:sz w:val="24"/>
+              </w:rPr>
+              <w:t>月</w:t>
+            </w:r>
+            <w:r>
+              <w:rPr>
+                <w:rFonts w:hint="eastAsia"/>
+                <w:sz w:val="24"/>
+              </w:rPr>
+              <w:t xml:space="preserve">     </w:t>
+            </w:r>
+            <w:r>
+              <w:rPr>
+                <w:rFonts w:hint="eastAsia"/>
+                <w:sz w:val="24"/>
+              </w:rPr>
+              <w:t>日</w:t>
             </w:r>
           </w:p>
         </w:tc>
       </w:tr>
     </w:tbl>
-    <w:p>
-      <w:bookmarkStart w:id="0" w:name="_GoBack"/>
-      <w:bookmarkEnd w:id="0"/>
-    </w:p>
+    <w:p/>
     <w:sectPr>
       <w:pgSz w:w="11906" w:h="16838"/>
       <w:pgMar w:top="1440" w:right="1800" w:bottom="1440" w:left="1800" w:header="851" w:footer="992" w:gutter="0"/>
-      <w:cols w:space="425" w:num="1"/>
-      <w:docGrid w:type="lines" w:linePitch="312" w:charSpace="0"/>
+      <w:cols w:space="425"/>
+      <w:docGrid w:type="lines" w:linePitch="312"/>
     </w:sectPr>
   </w:body>
 </w:document>
 </file>
 
 <file path=word/styles.xml><?xml version="1.0" encoding="utf-8"?>
-<w:styles xmlns:mc="http://schemas.openxmlformats.org/markup-compatibility/2006" xmlns:o="urn:schemas-microsoft-com:office:office" xmlns:r="http://schemas.openxmlformats.org/officeDocument/2006/relationships" xmlns:m="http://schemas.openxmlformats.org/officeDocument/2006/math" xmlns:v="urn:schemas-microsoft-com:vml" xmlns:w="http://schemas.openxmlformats.org/wordprocessingml/2006/main" xmlns:w14="http://schemas.microsoft.com/office/word/2010/wordml" xmlns:w10="urn:schemas-microsoft-com:office:word" xmlns:sl="http://schemas.openxmlformats.org/schemaLibrary/2006/main" xmlns:wpsCustomData="http://www.wps.cn/officeDocument/2013/wpsCustomData" mc:Ignorable="w14">
+<w:styles xmlns:mc="http://schemas.openxmlformats.org/markup-compatibility/2006" xmlns:r="http://schemas.openxmlformats.org/officeDocument/2006/relationships" xmlns:w="http://schemas.openxmlformats.org/wordprocessingml/2006/main" xmlns:w14="http://schemas.microsoft.com/office/word/2010/wordml" xmlns:w15="http://schemas.microsoft.com/office/word/2012/wordml" xmlns:w16cex="http://schemas.microsoft.com/office/word/2018/wordml/cex" xmlns:w16cid="http://schemas.microsoft.com/office/word/2016/wordml/cid" xmlns:w16="http://schemas.microsoft.com/office/word/2018/wordml" xmlns:w16du="http://schemas.microsoft.com/office/word/2023/wordml/word16du" xmlns:w16sdtdh="http://schemas.microsoft.com/office/word/2020/wordml/sdtdatahash" xmlns:w16sdtfl="http://schemas.microsoft.com/office/word/2024/wordml/sdtformatlock" xmlns:w16se="http://schemas.microsoft.com/office/word/2015/wordml/symex" mc:Ignorable="w14 w15 w16se w16cid w16 w16cex w16sdtdh w16sdtfl w16du">
   <w:docDefaults>
     <w:rPrDefault>
       <w:rPr>
-        <w:rFonts w:asciiTheme="minorHAnsi" w:hAnsiTheme="minorHAnsi" w:eastAsiaTheme="minorEastAsia" w:cstheme="minorBidi"/>
+        <w:rFonts w:asciiTheme="minorHAnsi" w:eastAsiaTheme="minorEastAsia" w:hAnsiTheme="minorHAnsi" w:cstheme="minorBidi"/>
+        <w:lang w:val="en-US" w:eastAsia="zh-CN" w:bidi="ar-SA"/>
       </w:rPr>
     </w:rPrDefault>
     <w:pPrDefault/>
   </w:docDefaults>
-  <w:latentStyles w:count="260" w:defQFormat="0" w:defUnhideWhenUsed="1" w:defSemiHidden="1" w:defUIPriority="99" w:defLockedState="0">
-    <w:lsdException w:qFormat="1" w:unhideWhenUsed="0" w:uiPriority="0" w:semiHidden="0" w:name="Normal"/>
-    <w:lsdException w:qFormat="1" w:unhideWhenUsed="0" w:uiPriority="9" w:semiHidden="0" w:name="heading 1"/>
-    <w:lsdException w:qFormat="1" w:uiPriority="9" w:name="heading 2"/>
-    <w:lsdException w:qFormat="1" w:uiPriority="9" w:name="heading 3"/>
-    <w:lsdException w:qFormat="1" w:uiPriority="9" w:name="heading 4"/>
-    <w:lsdException w:qFormat="1" w:uiPriority="9" w:name="heading 5"/>
-    <w:lsdException w:qFormat="1" w:uiPriority="9" w:name="heading 6"/>
-    <w:lsdException w:qFormat="1" w:uiPriority="9" w:name="heading 7"/>
-    <w:lsdException w:qFormat="1" w:uiPriority="9" w:name="heading 8"/>
-    <w:lsdException w:qFormat="1" w:uiPriority="9" w:name="heading 9"/>
-    <w:lsdException w:uiPriority="99" w:name="index 1"/>
-    <w:lsdException w:uiPriority="99" w:name="index 2"/>
-    <w:lsdException w:uiPriority="99" w:name="index 3"/>
-    <w:lsdException w:uiPriority="99" w:name="index 4"/>
-    <w:lsdException w:uiPriority="99" w:name="index 5"/>
-    <w:lsdException w:uiPriority="99" w:name="index 6"/>
-    <w:lsdException w:uiPriority="99" w:name="index 7"/>
-    <w:lsdException w:uiPriority="99" w:name="index 8"/>
-    <w:lsdException w:uiPriority="99" w:name="index 9"/>
-    <w:lsdException w:uiPriority="39" w:name="toc 1"/>
-    <w:lsdException w:uiPriority="39" w:name="toc 2"/>
-    <w:lsdException w:uiPriority="39" w:name="toc 3"/>
-    <w:lsdException w:uiPriority="39" w:name="toc 4"/>
-    <w:lsdException w:uiPriority="39" w:name="toc 5"/>
-    <w:lsdException w:uiPriority="39" w:name="toc 6"/>
-    <w:lsdException w:uiPriority="39" w:name="toc 7"/>
-    <w:lsdException w:uiPriority="39" w:name="toc 8"/>
-    <w:lsdException w:uiPriority="39" w:name="toc 9"/>
-    <w:lsdException w:uiPriority="99" w:name="Normal Indent"/>
-    <w:lsdException w:uiPriority="99" w:name="footnote text"/>
-    <w:lsdException w:uiPriority="99" w:name="annotation text"/>
-    <w:lsdException w:uiPriority="99" w:semiHidden="0" w:name="header"/>
-    <w:lsdException w:uiPriority="99" w:semiHidden="0" w:name="footer"/>
-    <w:lsdException w:uiPriority="99" w:name="index heading"/>
-    <w:lsdException w:qFormat="1" w:uiPriority="35" w:name="caption"/>
-    <w:lsdException w:uiPriority="99" w:name="table of figures"/>
-    <w:lsdException w:uiPriority="99" w:name="envelope address"/>
-    <w:lsdException w:uiPriority="99" w:name="envelope return"/>
-    <w:lsdException w:uiPriority="99" w:name="footnote reference"/>
-    <w:lsdException w:uiPriority="99" w:name="annotation reference"/>
-    <w:lsdException w:uiPriority="99" w:name="line number"/>
-    <w:lsdException w:uiPriority="99" w:name="page number"/>
-    <w:lsdException w:uiPriority="99" w:name="endnote reference"/>
-    <w:lsdException w:uiPriority="99" w:name="endnote text"/>
-    <w:lsdException w:uiPriority="99" w:name="table of authorities"/>
-    <w:lsdException w:uiPriority="99" w:name="macro"/>
-    <w:lsdException w:uiPriority="99" w:name="toa heading"/>
-    <w:lsdException w:uiPriority="99" w:name="List"/>
-    <w:lsdException w:uiPriority="99" w:name="List Bullet"/>
-    <w:lsdException w:uiPriority="99" w:name="List Number"/>
-    <w:lsdException w:uiPriority="99" w:name="List 2"/>
-    <w:lsdException w:uiPriority="99" w:name="List 3"/>
-    <w:lsdException w:uiPriority="99" w:name="List 4"/>
-    <w:lsdException w:uiPriority="99" w:name="List 5"/>
-    <w:lsdException w:uiPriority="99" w:name="List Bullet 2"/>
-    <w:lsdException w:uiPriority="99" w:name="List Bullet 3"/>
-    <w:lsdException w:uiPriority="99" w:name="List Bullet 4"/>
-    <w:lsdException w:uiPriority="99" w:name="List Bullet 5"/>
-    <w:lsdException w:uiPriority="99" w:name="List Number 2"/>
-    <w:lsdException w:uiPriority="99" w:name="List Number 3"/>
-    <w:lsdException w:uiPriority="99" w:name="List Number 4"/>
-    <w:lsdException w:uiPriority="99" w:name="List Number 5"/>
-    <w:lsdException w:qFormat="1" w:unhideWhenUsed="0" w:uiPriority="10" w:semiHidden="0" w:name="Title"/>
-    <w:lsdException w:uiPriority="99" w:name="Closing"/>
-    <w:lsdException w:uiPriority="99" w:name="Signature"/>
-    <w:lsdException w:uiPriority="1" w:name="Default Paragraph Font"/>
-    <w:lsdException w:uiPriority="99" w:name="Body Text"/>
-    <w:lsdException w:uiPriority="99" w:name="Body Text Indent"/>
-    <w:lsdException w:uiPriority="99" w:name="List Continue"/>
-    <w:lsdException w:uiPriority="99" w:name="List Continue 2"/>
-    <w:lsdException w:uiPriority="99" w:name="List Continue 3"/>
-    <w:lsdException w:uiPriority="99" w:name="List Continue 4"/>
-    <w:lsdException w:uiPriority="99" w:name="List Continue 5"/>
-    <w:lsdException w:uiPriority="99" w:name="Message Header"/>
-    <w:lsdException w:qFormat="1" w:unhideWhenUsed="0" w:uiPriority="11" w:semiHidden="0" w:name="Subtitle"/>
-    <w:lsdException w:uiPriority="99" w:name="Salutation"/>
-    <w:lsdException w:uiPriority="99" w:name="Date"/>
-    <w:lsdException w:uiPriority="99" w:name="Body Text First Indent"/>
-    <w:lsdException w:uiPriority="99" w:name="Body Text First Indent 2"/>
-    <w:lsdException w:uiPriority="99" w:name="Note Heading"/>
-    <w:lsdException w:uiPriority="99" w:name="Body Text 2"/>
-    <w:lsdException w:uiPriority="99" w:name="Body Text 3"/>
-    <w:lsdException w:uiPriority="99" w:name="Body Text Indent 2"/>
-    <w:lsdException w:uiPriority="99" w:name="Body Text Indent 3"/>
-    <w:lsdException w:uiPriority="99" w:name="Block Text"/>
-    <w:lsdException w:uiPriority="99" w:name="Hyperlink"/>
-    <w:lsdException w:uiPriority="99" w:name="FollowedHyperlink"/>
-    <w:lsdException w:qFormat="1" w:unhideWhenUsed="0" w:uiPriority="22" w:semiHidden="0" w:name="Strong"/>
-    <w:lsdException w:qFormat="1" w:unhideWhenUsed="0" w:uiPriority="20" w:semiHidden="0" w:name="Emphasis"/>
-    <w:lsdException w:uiPriority="99" w:name="Document Map"/>
-    <w:lsdException w:uiPriority="99" w:name="Plain Text"/>
-    <w:lsdException w:uiPriority="99" w:name="E-mail Signature"/>
-    <w:lsdException w:uiPriority="99" w:name="Normal (Web)"/>
-    <w:lsdException w:uiPriority="99" w:name="HTML Acronym"/>
-    <w:lsdException w:uiPriority="99" w:name="HTML Address"/>
-    <w:lsdException w:uiPriority="99" w:name="HTML Cite"/>
-    <w:lsdException w:uiPriority="99" w:name="HTML Code"/>
-    <w:lsdException w:uiPriority="99" w:name="HTML Definition"/>
-    <w:lsdException w:uiPriority="99" w:name="HTML Keyboard"/>
-    <w:lsdException w:uiPriority="99" w:name="HTML Preformatted"/>
-    <w:lsdException w:uiPriority="99" w:name="HTML Sample"/>
-    <w:lsdException w:uiPriority="99" w:name="HTML Typewriter"/>
-    <w:lsdException w:uiPriority="99" w:name="HTML Variable"/>
-    <w:lsdException w:uiPriority="99" w:name="Normal Table"/>
-    <w:lsdException w:uiPriority="99" w:name="annotation subject"/>
-    <w:lsdException w:uiPriority="99" w:name="Table Simple 1"/>
-    <w:lsdException w:uiPriority="99" w:name="Table Simple 2"/>
-    <w:lsdException w:uiPriority="99" w:name="Table Simple 3"/>
-    <w:lsdException w:uiPriority="99" w:name="Table Classic 1"/>
-    <w:lsdException w:uiPriority="99" w:name="Table Classic 2"/>
-    <w:lsdException w:uiPriority="99" w:name="Table Classic 3"/>
-    <w:lsdException w:uiPriority="99" w:name="Table Classic 4"/>
-    <w:lsdException w:uiPriority="99" w:name="Table Colorful 1"/>
-    <w:lsdException w:uiPriority="99" w:name="Table Colorful 2"/>
-    <w:lsdException w:uiPriority="99" w:name="Table Colorful 3"/>
-    <w:lsdException w:uiPriority="99" w:name="Table Columns 1"/>
-    <w:lsdException w:uiPriority="99" w:name="Table Columns 2"/>
-    <w:lsdException w:uiPriority="99" w:name="Table Columns 3"/>
-    <w:lsdException w:uiPriority="99" w:name="Table Columns 4"/>
-    <w:lsdException w:uiPriority="99" w:name="Table Columns 5"/>
-    <w:lsdException w:uiPriority="99" w:name="Table Grid 1"/>
-    <w:lsdException w:uiPriority="99" w:name="Table Grid 2"/>
-    <w:lsdException w:uiPriority="99" w:name="Table Grid 3"/>
-    <w:lsdException w:uiPriority="99" w:name="Table Grid 4"/>
-    <w:lsdException w:uiPriority="99" w:name="Table Grid 5"/>
-    <w:lsdException w:uiPriority="99" w:name="Table Grid 6"/>
-    <w:lsdException w:uiPriority="99" w:name="Table Grid 7"/>
-    <w:lsdException w:uiPriority="99" w:name="Table Grid 8"/>
-    <w:lsdException w:uiPriority="99" w:name="Table List 1"/>
-    <w:lsdException w:uiPriority="99" w:name="Table List 2"/>
-    <w:lsdException w:uiPriority="99" w:name="Table List 3"/>
-    <w:lsdException w:uiPriority="99" w:name="Table List 4"/>
-    <w:lsdException w:uiPriority="99" w:name="Table List 5"/>
-    <w:lsdException w:uiPriority="99" w:name="Table List 6"/>
-    <w:lsdException w:uiPriority="99" w:name="Table List 7"/>
-    <w:lsdException w:uiPriority="99" w:name="Table List 8"/>
-    <w:lsdException w:uiPriority="99" w:name="Table 3D effects 1"/>
-    <w:lsdException w:uiPriority="99" w:name="Table 3D effects 2"/>
-    <w:lsdException w:uiPriority="99" w:name="Table 3D effects 3"/>
-    <w:lsdException w:uiPriority="99" w:name="Table Contemporary"/>
-    <w:lsdException w:uiPriority="99" w:name="Table Elegant"/>
-    <w:lsdException w:uiPriority="99" w:name="Table Professional"/>
-    <w:lsdException w:uiPriority="99" w:name="Table Subtle 1"/>
-    <w:lsdException w:uiPriority="99" w:name="Table Subtle 2"/>
-    <w:lsdException w:uiPriority="99" w:name="Table Web 1"/>
-    <w:lsdException w:uiPriority="99" w:name="Table Web 2"/>
-    <w:lsdException w:uiPriority="99" w:name="Table Web 3"/>
-    <w:lsdException w:uiPriority="99" w:name="Balloon Text"/>
-    <w:lsdException w:unhideWhenUsed="0" w:uiPriority="39" w:semiHidden="0" w:name="Table Grid"/>
-    <w:lsdException w:uiPriority="99" w:name="Table Theme"/>
-    <w:lsdException w:unhideWhenUsed="0" w:uiPriority="60" w:semiHidden="0" w:name="Light Shading"/>
-    <w:lsdException w:unhideWhenUsed="0" w:uiPriority="61" w:semiHidden="0" w:name="Light List"/>
-    <w:lsdException w:unhideWhenUsed="0" w:uiPriority="62" w:semiHidden="0" w:name="Light Grid"/>
-    <w:lsdException w:unhideWhenUsed="0" w:uiPriority="63" w:semiHidden="0" w:name="Medium Shading 1"/>
-    <w:lsdException w:unhideWhenUsed="0" w:uiPriority="64" w:semiHidden="0" w:name="Medium Shading 2"/>
-    <w:lsdException w:unhideWhenUsed="0" w:uiPriority="65" w:semiHidden="0" w:name="Medium List 1"/>
-    <w:lsdException w:unhideWhenUsed="0" w:uiPriority="66" w:semiHidden="0" w:name="Medium List 2"/>
-    <w:lsdException w:unhideWhenUsed="0" w:uiPriority="67" w:semiHidden="0" w:name="Medium Grid 1"/>
-    <w:lsdException w:unhideWhenUsed="0" w:uiPriority="68" w:semiHidden="0" w:name="Medium Grid 2"/>
-    <w:lsdException w:unhideWhenUsed="0" w:uiPriority="69" w:semiHidden="0" w:name="Medium Grid 3"/>
-    <w:lsdException w:unhideWhenUsed="0" w:uiPriority="70" w:semiHidden="0" w:name="Dark List"/>
-    <w:lsdException w:unhideWhenUsed="0" w:uiPriority="71" w:semiHidden="0" w:name="Colorful Shading"/>
-    <w:lsdException w:unhideWhenUsed="0" w:uiPriority="72" w:semiHidden="0" w:name="Colorful List"/>
-    <w:lsdException w:unhideWhenUsed="0" w:uiPriority="73" w:semiHidden="0" w:name="Colorful Grid"/>
-    <w:lsdException w:unhideWhenUsed="0" w:uiPriority="60" w:semiHidden="0" w:name="Light Shading Accent 1"/>
-    <w:lsdException w:unhideWhenUsed="0" w:uiPriority="61" w:semiHidden="0" w:name="Light List Accent 1"/>
-    <w:lsdException w:unhideWhenUsed="0" w:uiPriority="62" w:semiHidden="0" w:name="Light Grid Accent 1"/>
-    <w:lsdException w:unhideWhenUsed="0" w:uiPriority="63" w:semiHidden="0" w:name="Medium Shading 1 Accent 1"/>
-    <w:lsdException w:unhideWhenUsed="0" w:uiPriority="64" w:semiHidden="0" w:name="Medium Shading 2 Accent 1"/>
-    <w:lsdException w:unhideWhenUsed="0" w:uiPriority="65" w:semiHidden="0" w:name="Medium List 1 Accent 1"/>
-    <w:lsdException w:unhideWhenUsed="0" w:uiPriority="66" w:semiHidden="0" w:name="Medium List 2 Accent 1"/>
-    <w:lsdException w:unhideWhenUsed="0" w:uiPriority="67" w:semiHidden="0" w:name="Medium Grid 1 Accent 1"/>
-    <w:lsdException w:unhideWhenUsed="0" w:uiPriority="68" w:semiHidden="0" w:name="Medium Grid 2 Accent 1"/>
-    <w:lsdException w:unhideWhenUsed="0" w:uiPriority="69" w:semiHidden="0" w:name="Medium Grid 3 Accent 1"/>
-    <w:lsdException w:unhideWhenUsed="0" w:uiPriority="70" w:semiHidden="0" w:name="Dark List Accent 1"/>
-    <w:lsdException w:unhideWhenUsed="0" w:uiPriority="71" w:semiHidden="0" w:name="Colorful Shading Accent 1"/>
-    <w:lsdException w:unhideWhenUsed="0" w:uiPriority="72" w:semiHidden="0" w:name="Colorful List Accent 1"/>
-    <w:lsdException w:unhideWhenUsed="0" w:uiPriority="73" w:semiHidden="0" w:name="Colorful Grid Accent 1"/>
-    <w:lsdException w:unhideWhenUsed="0" w:uiPriority="60" w:semiHidden="0" w:name="Light Shading Accent 2"/>
-    <w:lsdException w:unhideWhenUsed="0" w:uiPriority="61" w:semiHidden="0" w:name="Light List Accent 2"/>
-    <w:lsdException w:unhideWhenUsed="0" w:uiPriority="62" w:semiHidden="0" w:name="Light Grid Accent 2"/>
-    <w:lsdException w:unhideWhenUsed="0" w:uiPriority="63" w:semiHidden="0" w:name="Medium Shading 1 Accent 2"/>
-    <w:lsdException w:unhideWhenUsed="0" w:uiPriority="64" w:semiHidden="0" w:name="Medium Shading 2 Accent 2"/>
-    <w:lsdException w:unhideWhenUsed="0" w:uiPriority="65" w:semiHidden="0" w:name="Medium List 1 Accent 2"/>
-    <w:lsdException w:unhideWhenUsed="0" w:uiPriority="66" w:semiHidden="0" w:name="Medium List 2 Accent 2"/>
-    <w:lsdException w:unhideWhenUsed="0" w:uiPriority="67" w:semiHidden="0" w:name="Medium Grid 1 Accent 2"/>
-    <w:lsdException w:unhideWhenUsed="0" w:uiPriority="68" w:semiHidden="0" w:name="Medium Grid 2 Accent 2"/>
-    <w:lsdException w:unhideWhenUsed="0" w:uiPriority="69" w:semiHidden="0" w:name="Medium Grid 3 Accent 2"/>
-    <w:lsdException w:unhideWhenUsed="0" w:uiPriority="70" w:semiHidden="0" w:name="Dark List Accent 2"/>
-    <w:lsdException w:unhideWhenUsed="0" w:uiPriority="71" w:semiHidden="0" w:name="Colorful Shading Accent 2"/>
-    <w:lsdException w:unhideWhenUsed="0" w:uiPriority="72" w:semiHidden="0" w:name="Colorful List Accent 2"/>
-    <w:lsdException w:unhideWhenUsed="0" w:uiPriority="73" w:semiHidden="0" w:name="Colorful Grid Accent 2"/>
-    <w:lsdException w:unhideWhenUsed="0" w:uiPriority="60" w:semiHidden="0" w:name="Light Shading Accent 3"/>
-    <w:lsdException w:unhideWhenUsed="0" w:uiPriority="61" w:semiHidden="0" w:name="Light List Accent 3"/>
-    <w:lsdException w:unhideWhenUsed="0" w:uiPriority="62" w:semiHidden="0" w:name="Light Grid Accent 3"/>
-    <w:lsdException w:unhideWhenUsed="0" w:uiPriority="63" w:semiHidden="0" w:name="Medium Shading 1 Accent 3"/>
-    <w:lsdException w:unhideWhenUsed="0" w:uiPriority="64" w:semiHidden="0" w:name="Medium Shading 2 Accent 3"/>
-    <w:lsdException w:unhideWhenUsed="0" w:uiPriority="65" w:semiHidden="0" w:name="Medium List 1 Accent 3"/>
-    <w:lsdException w:unhideWhenUsed="0" w:uiPriority="66" w:semiHidden="0" w:name="Medium List 2 Accent 3"/>
-    <w:lsdException w:unhideWhenUsed="0" w:uiPriority="67" w:semiHidden="0" w:name="Medium Grid 1 Accent 3"/>
-    <w:lsdException w:unhideWhenUsed="0" w:uiPriority="68" w:semiHidden="0" w:name="Medium Grid 2 Accent 3"/>
-    <w:lsdException w:unhideWhenUsed="0" w:uiPriority="69" w:semiHidden="0" w:name="Medium Grid 3 Accent 3"/>
-    <w:lsdException w:unhideWhenUsed="0" w:uiPriority="70" w:semiHidden="0" w:name="Dark List Accent 3"/>
-    <w:lsdException w:unhideWhenUsed="0" w:uiPriority="71" w:semiHidden="0" w:name="Colorful Shading Accent 3"/>
-    <w:lsdException w:unhideWhenUsed="0" w:uiPriority="72" w:semiHidden="0" w:name="Colorful List Accent 3"/>
-    <w:lsdException w:unhideWhenUsed="0" w:uiPriority="73" w:semiHidden="0" w:name="Colorful Grid Accent 3"/>
-    <w:lsdException w:unhideWhenUsed="0" w:uiPriority="60" w:semiHidden="0" w:name="Light Shading Accent 4"/>
-    <w:lsdException w:unhideWhenUsed="0" w:uiPriority="61" w:semiHidden="0" w:name="Light List Accent 4"/>
-    <w:lsdException w:unhideWhenUsed="0" w:uiPriority="62" w:semiHidden="0" w:name="Light Grid Accent 4"/>
-    <w:lsdException w:unhideWhenUsed="0" w:uiPriority="63" w:semiHidden="0" w:name="Medium Shading 1 Accent 4"/>
-    <w:lsdException w:unhideWhenUsed="0" w:uiPriority="64" w:semiHidden="0" w:name="Medium Shading 2 Accent 4"/>
-    <w:lsdException w:unhideWhenUsed="0" w:uiPriority="65" w:semiHidden="0" w:name="Medium List 1 Accent 4"/>
-    <w:lsdException w:unhideWhenUsed="0" w:uiPriority="66" w:semiHidden="0" w:name="Medium List 2 Accent 4"/>
-    <w:lsdException w:unhideWhenUsed="0" w:uiPriority="67" w:semiHidden="0" w:name="Medium Grid 1 Accent 4"/>
-    <w:lsdException w:unhideWhenUsed="0" w:uiPriority="68" w:semiHidden="0" w:name="Medium Grid 2 Accent 4"/>
-    <w:lsdException w:unhideWhenUsed="0" w:uiPriority="69" w:semiHidden="0" w:name="Medium Grid 3 Accent 4"/>
-    <w:lsdException w:unhideWhenUsed="0" w:uiPriority="70" w:semiHidden="0" w:name="Dark List Accent 4"/>
-    <w:lsdException w:unhideWhenUsed="0" w:uiPriority="71" w:semiHidden="0" w:name="Colorful Shading Accent 4"/>
-    <w:lsdException w:unhideWhenUsed="0" w:uiPriority="72" w:semiHidden="0" w:name="Colorful List Accent 4"/>
-    <w:lsdException w:unhideWhenUsed="0" w:uiPriority="73" w:semiHidden="0" w:name="Colorful Grid Accent 4"/>
-    <w:lsdException w:unhideWhenUsed="0" w:uiPriority="60" w:semiHidden="0" w:name="Light Shading Accent 5"/>
-    <w:lsdException w:unhideWhenUsed="0" w:uiPriority="61" w:semiHidden="0" w:name="Light List Accent 5"/>
-    <w:lsdException w:unhideWhenUsed="0" w:uiPriority="62" w:semiHidden="0" w:name="Light Grid Accent 5"/>
-    <w:lsdException w:unhideWhenUsed="0" w:uiPriority="63" w:semiHidden="0" w:name="Medium Shading 1 Accent 5"/>
-    <w:lsdException w:unhideWhenUsed="0" w:uiPriority="64" w:semiHidden="0" w:name="Medium Shading 2 Accent 5"/>
-    <w:lsdException w:unhideWhenUsed="0" w:uiPriority="65" w:semiHidden="0" w:name="Medium List 1 Accent 5"/>
-    <w:lsdException w:unhideWhenUsed="0" w:uiPriority="66" w:semiHidden="0" w:name="Medium List 2 Accent 5"/>
-    <w:lsdException w:unhideWhenUsed="0" w:uiPriority="67" w:semiHidden="0" w:name="Medium Grid 1 Accent 5"/>
-    <w:lsdException w:unhideWhenUsed="0" w:uiPriority="68" w:semiHidden="0" w:name="Medium Grid 2 Accent 5"/>
-    <w:lsdException w:unhideWhenUsed="0" w:uiPriority="69" w:semiHidden="0" w:name="Medium Grid 3 Accent 5"/>
-    <w:lsdException w:unhideWhenUsed="0" w:uiPriority="70" w:semiHidden="0" w:name="Dark List Accent 5"/>
-    <w:lsdException w:unhideWhenUsed="0" w:uiPriority="71" w:semiHidden="0" w:name="Colorful Shading Accent 5"/>
-    <w:lsdException w:unhideWhenUsed="0" w:uiPriority="72" w:semiHidden="0" w:name="Colorful List Accent 5"/>
-    <w:lsdException w:unhideWhenUsed="0" w:uiPriority="73" w:semiHidden="0" w:name="Colorful Grid Accent 5"/>
-    <w:lsdException w:unhideWhenUsed="0" w:uiPriority="60" w:semiHidden="0" w:name="Light Shading Accent 6"/>
-    <w:lsdException w:unhideWhenUsed="0" w:uiPriority="61" w:semiHidden="0" w:name="Light List Accent 6"/>
-    <w:lsdException w:unhideWhenUsed="0" w:uiPriority="62" w:semiHidden="0" w:name="Light Grid Accent 6"/>
-    <w:lsdException w:unhideWhenUsed="0" w:uiPriority="63" w:semiHidden="0" w:name="Medium Shading 1 Accent 6"/>
-    <w:lsdException w:unhideWhenUsed="0" w:uiPriority="64" w:semiHidden="0" w:name="Medium Shading 2 Accent 6"/>
-    <w:lsdException w:unhideWhenUsed="0" w:uiPriority="65" w:semiHidden="0" w:name="Medium List 1 Accent 6"/>
-    <w:lsdException w:unhideWhenUsed="0" w:uiPriority="66" w:semiHidden="0" w:name="Medium List 2 Accent 6"/>
-    <w:lsdException w:unhideWhenUsed="0" w:uiPriority="67" w:semiHidden="0" w:name="Medium Grid 1 Accent 6"/>
-    <w:lsdException w:unhideWhenUsed="0" w:uiPriority="68" w:semiHidden="0" w:name="Medium Grid 2 Accent 6"/>
-    <w:lsdException w:unhideWhenUsed="0" w:uiPriority="69" w:semiHidden="0" w:name="Medium Grid 3 Accent 6"/>
-    <w:lsdException w:unhideWhenUsed="0" w:uiPriority="70" w:semiHidden="0" w:name="Dark List Accent 6"/>
-    <w:lsdException w:unhideWhenUsed="0" w:uiPriority="71" w:semiHidden="0" w:name="Colorful Shading Accent 6"/>
-    <w:lsdException w:unhideWhenUsed="0" w:uiPriority="72" w:semiHidden="0" w:name="Colorful List Accent 6"/>
-    <w:lsdException w:unhideWhenUsed="0" w:uiPriority="73" w:semiHidden="0" w:name="Colorful Grid Accent 6"/>
+  <w:latentStyles w:defLockedState="0" w:defUIPriority="99" w:defSemiHidden="0" w:defUnhideWhenUsed="0" w:defQFormat="0" w:count="376">
+    <w:lsdException w:name="Normal" w:uiPriority="0" w:qFormat="1"/>
+    <w:lsdException w:name="heading 1" w:uiPriority="9" w:qFormat="1"/>
+    <w:lsdException w:name="heading 2" w:semiHidden="1" w:uiPriority="9" w:unhideWhenUsed="1" w:qFormat="1"/>
+    <w:lsdException w:name="heading 3" w:semiHidden="1" w:uiPriority="9" w:unhideWhenUsed="1" w:qFormat="1"/>
+    <w:lsdException w:name="heading 4" w:semiHidden="1" w:uiPriority="9" w:unhideWhenUsed="1" w:qFormat="1"/>
+    <w:lsdException w:name="heading 5" w:semiHidden="1" w:uiPriority="9" w:unhideWhenUsed="1" w:qFormat="1"/>
+    <w:lsdException w:name="heading 6" w:semiHidden="1" w:uiPriority="9" w:unhideWhenUsed="1" w:qFormat="1"/>
+    <w:lsdException w:name="heading 7" w:semiHidden="1" w:uiPriority="9" w:unhideWhenUsed="1" w:qFormat="1"/>
+    <w:lsdException w:name="heading 8" w:semiHidden="1" w:uiPriority="9" w:unhideWhenUsed="1" w:qFormat="1"/>
+    <w:lsdException w:name="heading 9" w:semiHidden="1" w:uiPriority="9" w:unhideWhenUsed="1" w:qFormat="1"/>
+    <w:lsdException w:name="index 1" w:semiHidden="1" w:unhideWhenUsed="1"/>
+    <w:lsdException w:name="index 2" w:semiHidden="1" w:unhideWhenUsed="1"/>
+    <w:lsdException w:name="index 3" w:semiHidden="1" w:unhideWhenUsed="1"/>
+    <w:lsdException w:name="index 4" w:semiHidden="1" w:unhideWhenUsed="1"/>
+    <w:lsdException w:name="index 5" w:semiHidden="1" w:unhideWhenUsed="1"/>
+    <w:lsdException w:name="index 6" w:semiHidden="1" w:unhideWhenUsed="1"/>
+    <w:lsdException w:name="index 7" w:semiHidden="1" w:unhideWhenUsed="1"/>
+    <w:lsdException w:name="index 8" w:semiHidden="1" w:unhideWhenUsed="1"/>
+    <w:lsdException w:name="index 9" w:semiHidden="1" w:unhideWhenUsed="1"/>
+    <w:lsdException w:name="toc 1" w:semiHidden="1" w:uiPriority="39" w:unhideWhenUsed="1"/>
+    <w:lsdException w:name="toc 2" w:semiHidden="1" w:uiPriority="39" w:unhideWhenUsed="1"/>
+    <w:lsdException w:name="toc 3" w:semiHidden="1" w:uiPriority="39" w:unhideWhenUsed="1"/>
+    <w:lsdException w:name="toc 4" w:semiHidden="1" w:uiPriority="39" w:unhideWhenUsed="1"/>
+    <w:lsdException w:name="toc 5" w:semiHidden="1" w:uiPriority="39" w:unhideWhenUsed="1"/>
+    <w:lsdException w:name="toc 6" w:semiHidden="1" w:uiPriority="39" w:unhideWhenUsed="1"/>
+    <w:lsdException w:name="toc 7" w:semiHidden="1" w:uiPriority="39" w:unhideWhenUsed="1"/>
+    <w:lsdException w:name="toc 8" w:semiHidden="1" w:uiPriority="39" w:unhideWhenUsed="1"/>
+    <w:lsdException w:name="toc 9" w:semiHidden="1" w:uiPriority="39" w:unhideWhenUsed="1"/>
+    <w:lsdException w:name="Normal Indent" w:semiHidden="1" w:unhideWhenUsed="1"/>
+    <w:lsdException w:name="footnote text" w:semiHidden="1" w:unhideWhenUsed="1"/>
+    <w:lsdException w:name="annotation text" w:semiHidden="1" w:unhideWhenUsed="1"/>
+    <w:lsdException w:name="header" w:unhideWhenUsed="1"/>
+    <w:lsdException w:name="footer" w:unhideWhenUsed="1"/>
+    <w:lsdException w:name="index heading" w:semiHidden="1" w:unhideWhenUsed="1"/>
+    <w:lsdException w:name="caption" w:semiHidden="1" w:uiPriority="35" w:unhideWhenUsed="1" w:qFormat="1"/>
+    <w:lsdException w:name="table of figures" w:semiHidden="1" w:unhideWhenUsed="1"/>
+    <w:lsdException w:name="envelope address" w:semiHidden="1" w:unhideWhenUsed="1"/>
+    <w:lsdException w:name="envelope return" w:semiHidden="1" w:unhideWhenUsed="1"/>
+    <w:lsdException w:name="footnote reference" w:semiHidden="1" w:unhideWhenUsed="1"/>
+    <w:lsdException w:name="annotation reference" w:semiHidden="1" w:unhideWhenUsed="1"/>
+    <w:lsdException w:name="line number" w:semiHidden="1" w:unhideWhenUsed="1"/>
+    <w:lsdException w:name="page number" w:semiHidden="1" w:unhideWhenUsed="1"/>
+    <w:lsdException w:name="endnote reference" w:semiHidden="1" w:unhideWhenUsed="1"/>
+    <w:lsdException w:name="endnote text" w:semiHidden="1" w:unhideWhenUsed="1"/>
+    <w:lsdException w:name="table of authorities" w:semiHidden="1" w:unhideWhenUsed="1"/>
+    <w:lsdException w:name="macro" w:semiHidden="1" w:unhideWhenUsed="1"/>
+    <w:lsdException w:name="toa heading" w:semiHidden="1" w:unhideWhenUsed="1"/>
+    <w:lsdException w:name="List" w:semiHidden="1" w:unhideWhenUsed="1"/>
+    <w:lsdException w:name="List Bullet" w:semiHidden="1" w:unhideWhenUsed="1"/>
+    <w:lsdException w:name="List Number" w:semiHidden="1" w:unhideWhenUsed="1"/>
+    <w:lsdException w:name="List 2" w:semiHidden="1" w:unhideWhenUsed="1"/>
+    <w:lsdException w:name="List 3" w:semiHidden="1" w:unhideWhenUsed="1"/>
+    <w:lsdException w:name="List 4" w:semiHidden="1" w:unhideWhenUsed="1"/>
+    <w:lsdException w:name="List 5" w:semiHidden="1" w:unhideWhenUsed="1"/>
+    <w:lsdException w:name="List Bullet 2" w:semiHidden="1" w:unhideWhenUsed="1"/>
+    <w:lsdException w:name="List Bullet 3" w:semiHidden="1" w:unhideWhenUsed="1"/>
+    <w:lsdException w:name="List Bullet 4" w:semiHidden="1" w:unhideWhenUsed="1"/>
+    <w:lsdException w:name="List Bullet 5" w:semiHidden="1" w:unhideWhenUsed="1"/>
+    <w:lsdException w:name="List Number 2" w:semiHidden="1" w:unhideWhenUsed="1"/>
+    <w:lsdException w:name="List Number 3" w:semiHidden="1" w:unhideWhenUsed="1"/>
+    <w:lsdException w:name="List Number 4" w:semiHidden="1" w:unhideWhenUsed="1"/>
+    <w:lsdException w:name="List Number 5" w:semiHidden="1" w:unhideWhenUsed="1"/>
+    <w:lsdException w:name="Title" w:uiPriority="10" w:qFormat="1"/>
+    <w:lsdException w:name="Closing" w:semiHidden="1" w:unhideWhenUsed="1"/>
+    <w:lsdException w:name="Signature" w:semiHidden="1" w:unhideWhenUsed="1"/>
+    <w:lsdException w:name="Default Paragraph Font" w:semiHidden="1" w:uiPriority="1" w:unhideWhenUsed="1"/>
+    <w:lsdException w:name="Body Text" w:semiHidden="1" w:unhideWhenUsed="1"/>
+    <w:lsdException w:name="Body Text Indent" w:semiHidden="1" w:unhideWhenUsed="1"/>
+    <w:lsdException w:name="List Continue" w:semiHidden="1" w:unhideWhenUsed="1"/>
+    <w:lsdException w:name="List Continue 2" w:semiHidden="1" w:unhideWhenUsed="1"/>
+    <w:lsdException w:name="List Continue 3" w:semiHidden="1" w:unhideWhenUsed="1"/>
+    <w:lsdException w:name="List Continue 4" w:semiHidden="1" w:unhideWhenUsed="1"/>
+    <w:lsdException w:name="List Continue 5" w:semiHidden="1" w:unhideWhenUsed="1"/>
+    <w:lsdException w:name="Message Header" w:semiHidden="1" w:unhideWhenUsed="1"/>
+    <w:lsdException w:name="Subtitle" w:uiPriority="11" w:qFormat="1"/>
+    <w:lsdException w:name="Salutation" w:semiHidden="1" w:unhideWhenUsed="1"/>
+    <w:lsdException w:name="Date" w:semiHidden="1" w:unhideWhenUsed="1"/>
+    <w:lsdException w:name="Body Text First Indent" w:semiHidden="1" w:unhideWhenUsed="1"/>
+    <w:lsdException w:name="Body Text First Indent 2" w:semiHidden="1" w:unhideWhenUsed="1"/>
+    <w:lsdException w:name="Note Heading" w:semiHidden="1" w:unhideWhenUsed="1"/>
+    <w:lsdException w:name="Body Text 2" w:semiHidden="1" w:unhideWhenUsed="1"/>
+    <w:lsdException w:name="Body Text 3" w:semiHidden="1" w:unhideWhenUsed="1"/>
+    <w:lsdException w:name="Body Text Indent 2" w:semiHidden="1" w:unhideWhenUsed="1"/>
+    <w:lsdException w:name="Body Text Indent 3" w:semiHidden="1" w:unhideWhenUsed="1"/>
+    <w:lsdException w:name="Block Text" w:semiHidden="1" w:unhideWhenUsed="1"/>
+    <w:lsdException w:name="Hyperlink" w:semiHidden="1" w:unhideWhenUsed="1"/>
+    <w:lsdException w:name="FollowedHyperlink" w:semiHidden="1" w:unhideWhenUsed="1"/>
+    <w:lsdException w:name="Strong" w:uiPriority="22" w:qFormat="1"/>
+    <w:lsdException w:name="Emphasis" w:uiPriority="20" w:qFormat="1"/>
+    <w:lsdException w:name="Document Map" w:semiHidden="1" w:unhideWhenUsed="1"/>
+    <w:lsdException w:name="Plain Text" w:semiHidden="1" w:unhideWhenUsed="1"/>
+    <w:lsdException w:name="E-mail Signature" w:semiHidden="1" w:unhideWhenUsed="1"/>
+    <w:lsdException w:name="HTML Top of Form" w:semiHidden="1" w:unhideWhenUsed="1"/>
+    <w:lsdException w:name="HTML Bottom of Form" w:semiHidden="1" w:unhideWhenUsed="1"/>
+    <w:lsdException w:name="Normal (Web)" w:semiHidden="1" w:unhideWhenUsed="1"/>
+    <w:lsdException w:name="HTML Acronym" w:semiHidden="1" w:unhideWhenUsed="1"/>
+    <w:lsdException w:name="HTML Address" w:semiHidden="1" w:unhideWhenUsed="1"/>
+    <w:lsdException w:name="HTML Cite" w:semiHidden="1" w:unhideWhenUsed="1"/>
+    <w:lsdException w:name="HTML Code" w:semiHidden="1" w:unhideWhenUsed="1"/>
+    <w:lsdException w:name="HTML Definition" w:semiHidden="1" w:unhideWhenUsed="1"/>
+    <w:lsdException w:name="HTML Keyboard" w:semiHidden="1" w:unhideWhenUsed="1"/>
+    <w:lsdException w:name="HTML Preformatted" w:semiHidden="1" w:unhideWhenUsed="1"/>
+    <w:lsdException w:name="HTML Sample" w:semiHidden="1" w:unhideWhenUsed="1"/>
+    <w:lsdException w:name="HTML Typewriter" w:semiHidden="1" w:unhideWhenUsed="1"/>
+    <w:lsdException w:name="HTML Variable" w:semiHidden="1" w:unhideWhenUsed="1"/>
+    <w:lsdException w:name="Normal Table" w:semiHidden="1" w:unhideWhenUsed="1"/>
+    <w:lsdException w:name="annotation subject" w:semiHidden="1" w:unhideWhenUsed="1"/>
+    <w:lsdException w:name="No List" w:semiHidden="1" w:unhideWhenUsed="1"/>
+    <w:lsdException w:name="Outline List 1" w:semiHidden="1" w:unhideWhenUsed="1"/>
+    <w:lsdException w:name="Outline List 2" w:semiHidden="1" w:unhideWhenUsed="1"/>
+    <w:lsdException w:name="Outline List 3" w:semiHidden="1" w:unhideWhenUsed="1"/>
+    <w:lsdException w:name="Table Simple 1" w:semiHidden="1" w:unhideWhenUsed="1"/>
+    <w:lsdException w:name="Table Simple 2" w:semiHidden="1" w:unhideWhenUsed="1"/>
+    <w:lsdException w:name="Table Simple 3" w:semiHidden="1" w:unhideWhenUsed="1"/>
+    <w:lsdException w:name="Table Classic 1" w:semiHidden="1" w:unhideWhenUsed="1"/>
+    <w:lsdException w:name="Table Classic 2" w:semiHidden="1" w:unhideWhenUsed="1"/>
+    <w:lsdException w:name="Table Classic 3" w:semiHidden="1" w:unhideWhenUsed="1"/>
+    <w:lsdException w:name="Table Classic 4" w:semiHidden="1" w:unhideWhenUsed="1"/>
+    <w:lsdException w:name="Table Colorful 1" w:semiHidden="1" w:unhideWhenUsed="1"/>
+    <w:lsdException w:name="Table Colorful 2" w:semiHidden="1" w:unhideWhenUsed="1"/>
+    <w:lsdException w:name="Table Colorful 3" w:semiHidden="1" w:unhideWhenUsed="1"/>
+    <w:lsdException w:name="Table Columns 1" w:semiHidden="1" w:unhideWhenUsed="1"/>
+    <w:lsdException w:name="Table Columns 2" w:semiHidden="1" w:unhideWhenUsed="1"/>
+    <w:lsdException w:name="Table Columns 3" w:semiHidden="1" w:unhideWhenUsed="1"/>
+    <w:lsdException w:name="Table Columns 4" w:semiHidden="1" w:unhideWhenUsed="1"/>
+    <w:lsdException w:name="Table Columns 5" w:semiHidden="1" w:unhideWhenUsed="1"/>
+    <w:lsdException w:name="Table Grid 1" w:semiHidden="1" w:unhideWhenUsed="1"/>
+    <w:lsdException w:name="Table Grid 2" w:semiHidden="1" w:unhideWhenUsed="1"/>
+    <w:lsdException w:name="Table Grid 3" w:semiHidden="1" w:unhideWhenUsed="1"/>
+    <w:lsdException w:name="Table Grid 4" w:semiHidden="1" w:unhideWhenUsed="1"/>
+    <w:lsdException w:name="Table Grid 5" w:semiHidden="1" w:unhideWhenUsed="1"/>
+    <w:lsdException w:name="Table Grid 6" w:semiHidden="1" w:unhideWhenUsed="1"/>
+    <w:lsdException w:name="Table Grid 7" w:semiHidden="1" w:unhideWhenUsed="1"/>
+    <w:lsdException w:name="Table Grid 8" w:semiHidden="1" w:unhideWhenUsed="1"/>
+    <w:lsdException w:name="Table List 1" w:semiHidden="1" w:unhideWhenUsed="1"/>
+    <w:lsdException w:name="Table List 2" w:semiHidden="1" w:unhideWhenUsed="1"/>
+    <w:lsdException w:name="Table List 3" w:semiHidden="1" w:unhideWhenUsed="1"/>
+    <w:lsdException w:name="Table List 4" w:semiHidden="1" w:unhideWhenUsed="1"/>
+    <w:lsdException w:name="Table List 5" w:semiHidden="1" w:unhideWhenUsed="1"/>
+    <w:lsdException w:name="Table List 6" w:semiHidden="1" w:unhideWhenUsed="1"/>
+    <w:lsdException w:name="Table List 7" w:semiHidden="1" w:unhideWhenUsed="1"/>
+    <w:lsdException w:name="Table List 8" w:semiHidden="1" w:unhideWhenUsed="1"/>
+    <w:lsdException w:name="Table 3D effects 1" w:semiHidden="1" w:unhideWhenUsed="1"/>
+    <w:lsdException w:name="Table 3D effects 2" w:semiHidden="1" w:unhideWhenUsed="1"/>
+    <w:lsdException w:name="Table 3D effects 3" w:semiHidden="1" w:unhideWhenUsed="1"/>
+    <w:lsdException w:name="Table Contemporary" w:semiHidden="1" w:unhideWhenUsed="1"/>
+    <w:lsdException w:name="Table Elegant" w:semiHidden="1" w:unhideWhenUsed="1"/>
+    <w:lsdException w:name="Table Professional" w:semiHidden="1" w:unhideWhenUsed="1"/>
+    <w:lsdException w:name="Table Subtle 1" w:semiHidden="1" w:unhideWhenUsed="1"/>
+    <w:lsdException w:name="Table Subtle 2" w:semiHidden="1" w:unhideWhenUsed="1"/>
+    <w:lsdException w:name="Table Web 1" w:semiHidden="1" w:unhideWhenUsed="1"/>
+    <w:lsdException w:name="Table Web 2" w:semiHidden="1" w:unhideWhenUsed="1"/>
+    <w:lsdException w:name="Table Web 3" w:semiHidden="1" w:unhideWhenUsed="1"/>
+    <w:lsdException w:name="Balloon Text" w:semiHidden="1" w:unhideWhenUsed="1"/>
+    <w:lsdException w:name="Table Grid" w:uiPriority="39"/>
+    <w:lsdException w:name="Table Theme" w:semiHidden="1" w:unhideWhenUsed="1"/>
+    <w:lsdException w:name="Placeholder Text" w:semiHidden="1" w:unhideWhenUsed="1"/>
+    <w:lsdException w:name="No Spacing" w:semiHidden="1" w:unhideWhenUsed="1"/>
+    <w:lsdException w:name="Light Shading" w:uiPriority="60"/>
+    <w:lsdException w:name="Light List" w:uiPriority="61"/>
+    <w:lsdException w:name="Light Grid" w:uiPriority="62"/>
+    <w:lsdException w:name="Medium Shading 1" w:uiPriority="63"/>
+    <w:lsdException w:name="Medium Shading 2" w:uiPriority="64"/>
+    <w:lsdException w:name="Medium List 1" w:uiPriority="65"/>
+    <w:lsdException w:name="Medium List 2" w:uiPriority="66"/>
+    <w:lsdException w:name="Medium Grid 1" w:uiPriority="67"/>
+    <w:lsdException w:name="Medium Grid 2" w:uiPriority="68"/>
+    <w:lsdException w:name="Medium Grid 3" w:uiPriority="69"/>
+    <w:lsdException w:name="Dark List" w:uiPriority="70"/>
+    <w:lsdException w:name="Colorful Shading" w:uiPriority="71"/>
+    <w:lsdException w:name="Colorful List" w:uiPriority="72"/>
+    <w:lsdException w:name="Colorful Grid" w:uiPriority="73"/>
+    <w:lsdException w:name="Light Shading Accent 1" w:uiPriority="60"/>
+    <w:lsdException w:name="Light List Accent 1" w:uiPriority="61"/>
+    <w:lsdException w:name="Light Grid Accent 1" w:uiPriority="62"/>
+    <w:lsdException w:name="Medium Shading 1 Accent 1" w:uiPriority="63"/>
+    <w:lsdException w:name="Medium Shading 2 Accent 1" w:uiPriority="64"/>
+    <w:lsdException w:name="Medium List 1 Accent 1" w:uiPriority="65"/>
+    <w:lsdException w:name="Revision" w:semiHidden="1" w:unhideWhenUsed="1"/>
+    <w:lsdException w:name="List Paragraph" w:semiHidden="1" w:unhideWhenUsed="1"/>
+    <w:lsdException w:name="Quote" w:semiHidden="1" w:unhideWhenUsed="1"/>
+    <w:lsdException w:name="Intense Quote" w:semiHidden="1" w:unhideWhenUsed="1"/>
+    <w:lsdException w:name="Medium List 2 Accent 1" w:uiPriority="66"/>
+    <w:lsdException w:name="Medium Grid 1 Accent 1" w:uiPriority="67"/>
+    <w:lsdException w:name="Medium Grid 2 Accent 1" w:uiPriority="68"/>
+    <w:lsdException w:name="Medium Grid 3 Accent 1" w:uiPriority="69"/>
+    <w:lsdException w:name="Dark List Accent 1" w:uiPriority="70"/>
+    <w:lsdException w:name="Colorful Shading Accent 1" w:uiPriority="71"/>
+    <w:lsdException w:name="Colorful List Accent 1" w:uiPriority="72"/>
+    <w:lsdException w:name="Colorful Grid Accent 1" w:uiPriority="73"/>
+    <w:lsdException w:name="Light Shading Accent 2" w:uiPriority="60"/>
+    <w:lsdException w:name="Light List Accent 2" w:uiPriority="61"/>
+    <w:lsdException w:name="Light Grid Accent 2" w:uiPriority="62"/>
+    <w:lsdException w:name="Medium Shading 1 Accent 2" w:uiPriority="63"/>
+    <w:lsdException w:name="Medium Shading 2 Accent 2" w:uiPriority="64"/>
+    <w:lsdException w:name="Medium List 1 Accent 2" w:uiPriority="65"/>
+    <w:lsdException w:name="Medium List 2 Accent 2" w:uiPriority="66"/>
+    <w:lsdException w:name="Medium Grid 1 Accent 2" w:uiPriority="67"/>
+    <w:lsdException w:name="Medium Grid 2 Accent 2" w:uiPriority="68"/>
+    <w:lsdException w:name="Medium Grid 3 Accent 2" w:uiPriority="69"/>
+    <w:lsdException w:name="Dark List Accent 2" w:uiPriority="70"/>
+    <w:lsdException w:name="Colorful Shading Accent 2" w:uiPriority="71"/>
+    <w:lsdException w:name="Colorful List Accent 2" w:uiPriority="72"/>
+    <w:lsdException w:name="Colorful Grid Accent 2" w:uiPriority="73"/>
+    <w:lsdException w:name="Light Shading Accent 3" w:uiPriority="60"/>
+    <w:lsdException w:name="Light List Accent 3" w:uiPriority="61"/>
+    <w:lsdException w:name="Light Grid Accent 3" w:uiPriority="62"/>
+    <w:lsdException w:name="Medium Shading 1 Accent 3" w:uiPriority="63"/>
+    <w:lsdException w:name="Medium Shading 2 Accent 3" w:uiPriority="64"/>
+    <w:lsdException w:name="Medium List 1 Accent 3" w:uiPriority="65"/>
+    <w:lsdException w:name="Medium List 2 Accent 3" w:uiPriority="66"/>
+    <w:lsdException w:name="Medium Grid 1 Accent 3" w:uiPriority="67"/>
+    <w:lsdException w:name="Medium Grid 2 Accent 3" w:uiPriority="68"/>
+    <w:lsdException w:name="Medium Grid 3 Accent 3" w:uiPriority="69"/>
+    <w:lsdException w:name="Dark List Accent 3" w:uiPriority="70"/>
+    <w:lsdException w:name="Colorful Shading Accent 3" w:uiPriority="71"/>
+    <w:lsdException w:name="Colorful List Accent 3" w:uiPriority="72"/>
+    <w:lsdException w:name="Colorful Grid Accent 3" w:uiPriority="73"/>
+    <w:lsdException w:name="Light Shading Accent 4" w:uiPriority="60"/>
+    <w:lsdException w:name="Light List Accent 4" w:uiPriority="61"/>
+    <w:lsdException w:name="Light Grid Accent 4" w:uiPriority="62"/>
+    <w:lsdException w:name="Medium Shading 1 Accent 4" w:uiPriority="63"/>
+    <w:lsdException w:name="Medium Shading 2 Accent 4" w:uiPriority="64"/>
+    <w:lsdException w:name="Medium List 1 Accent 4" w:uiPriority="65"/>
+    <w:lsdException w:name="Medium List 2 Accent 4" w:uiPriority="66"/>
+    <w:lsdException w:name="Medium Grid 1 Accent 4" w:uiPriority="67"/>
+    <w:lsdException w:name="Medium Grid 2 Accent 4" w:uiPriority="68"/>
+    <w:lsdException w:name="Medium Grid 3 Accent 4" w:uiPriority="69"/>
+    <w:lsdException w:name="Dark List Accent 4" w:uiPriority="70"/>
+    <w:lsdException w:name="Colorful Shading Accent 4" w:uiPriority="71"/>
+    <w:lsdException w:name="Colorful List Accent 4" w:uiPriority="72"/>
+    <w:lsdException w:name="Colorful Grid Accent 4" w:uiPriority="73"/>
+    <w:lsdException w:name="Light Shading Accent 5" w:uiPriority="60"/>
+    <w:lsdException w:name="Light List Accent 5" w:uiPriority="61"/>
+    <w:lsdException w:name="Light Grid Accent 5" w:uiPriority="62"/>
+    <w:lsdException w:name="Medium Shading 1 Accent 5" w:uiPriority="63"/>
+    <w:lsdException w:name="Medium Shading 2 Accent 5" w:uiPriority="64"/>
+    <w:lsdException w:name="Medium List 1 Accent 5" w:uiPriority="65"/>
+    <w:lsdException w:name="Medium List 2 Accent 5" w:uiPriority="66"/>
+    <w:lsdException w:name="Medium Grid 1 Accent 5" w:uiPriority="67"/>
+    <w:lsdException w:name="Medium Grid 2 Accent 5" w:uiPriority="68"/>
+    <w:lsdException w:name="Medium Grid 3 Accent 5" w:uiPriority="69"/>
+    <w:lsdException w:name="Dark List Accent 5" w:uiPriority="70"/>
+    <w:lsdException w:name="Colorful Shading Accent 5" w:uiPriority="71"/>
+    <w:lsdException w:name="Colorful List Accent 5" w:uiPriority="72"/>
+    <w:lsdException w:name="Colorful Grid Accent 5" w:uiPriority="73"/>
+    <w:lsdException w:name="Light Shading Accent 6" w:uiPriority="60"/>
+    <w:lsdException w:name="Light List Accent 6" w:uiPriority="61"/>
+    <w:lsdException w:name="Light Grid Accent 6" w:uiPriority="62"/>
+    <w:lsdException w:name="Medium Shading 1 Accent 6" w:uiPriority="63"/>
+    <w:lsdException w:name="Medium Shading 2 Accent 6" w:uiPriority="64"/>
+    <w:lsdException w:name="Medium List 1 Accent 6" w:uiPriority="65"/>
+    <w:lsdException w:name="Medium List 2 Accent 6" w:uiPriority="66"/>
+    <w:lsdException w:name="Medium Grid 1 Accent 6" w:uiPriority="67"/>
+    <w:lsdException w:name="Medium Grid 2 Accent 6" w:uiPriority="68"/>
+    <w:lsdException w:name="Medium Grid 3 Accent 6" w:uiPriority="69"/>
+    <w:lsdException w:name="Dark List Accent 6" w:uiPriority="70"/>
+    <w:lsdException w:name="Colorful Shading Accent 6" w:uiPriority="71"/>
+    <w:lsdException w:name="Colorful List Accent 6" w:uiPriority="72"/>
+    <w:lsdException w:name="Colorful Grid Accent 6" w:uiPriority="73"/>
+    <w:lsdException w:name="Subtle Emphasis" w:uiPriority="19" w:qFormat="1"/>
+    <w:lsdException w:name="Intense Emphasis" w:uiPriority="21" w:qFormat="1"/>
+    <w:lsdException w:name="Subtle Reference" w:uiPriority="31" w:qFormat="1"/>
+    <w:lsdException w:name="Intense Reference" w:uiPriority="32" w:qFormat="1"/>
+    <w:lsdException w:name="Book Title" w:uiPriority="33" w:qFormat="1"/>
+    <w:lsdException w:name="Bibliography" w:semiHidden="1" w:uiPriority="37" w:unhideWhenUsed="1"/>
+    <w:lsdException w:name="TOC Heading" w:semiHidden="1" w:uiPriority="39" w:unhideWhenUsed="1" w:qFormat="1"/>
+    <w:lsdException w:name="Plain Table 1" w:uiPriority="41"/>
+    <w:lsdException w:name="Plain Table 2" w:uiPriority="42"/>
+    <w:lsdException w:name="Plain Table 3" w:uiPriority="43"/>
+    <w:lsdException w:name="Plain Table 4" w:uiPriority="44"/>
+    <w:lsdException w:name="Plain Table 5" w:uiPriority="45"/>
+    <w:lsdException w:name="Grid Table Light" w:uiPriority="40"/>
+    <w:lsdException w:name="Grid Table 1 Light" w:uiPriority="46"/>
+    <w:lsdException w:name="Grid Table 2" w:uiPriority="47"/>
+    <w:lsdException w:name="Grid Table 3" w:uiPriority="48"/>
+    <w:lsdException w:name="Grid Table 4" w:uiPriority="49"/>
+    <w:lsdException w:name="Grid Table 5 Dark" w:uiPriority="50"/>
+    <w:lsdException w:name="Grid Table 6 Colorful" w:uiPriority="51"/>
+    <w:lsdException w:name="Grid Table 7 Colorful" w:uiPriority="52"/>
+    <w:lsdException w:name="Grid Table 1 Light Accent 1" w:uiPriority="46"/>
+    <w:lsdException w:name="Grid Table 2 Accent 1" w:uiPriority="47"/>
+    <w:lsdException w:name="Grid Table 3 Accent 1" w:uiPriority="48"/>
+    <w:lsdException w:name="Grid Table 4 Accent 1" w:uiPriority="49"/>
+    <w:lsdException w:name="Grid Table 5 Dark Accent 1" w:uiPriority="50"/>
+    <w:lsdException w:name="Grid Table 6 Colorful Accent 1" w:uiPriority="51"/>
+    <w:lsdException w:name="Grid Table 7 Colorful Accent 1" w:uiPriority="52"/>
+    <w:lsdException w:name="Grid Table 1 Light Accent 2" w:uiPriority="46"/>
+    <w:lsdException w:name="Grid Table 2 Accent 2" w:uiPriority="47"/>
+    <w:lsdException w:name="Grid Table 3 Accent 2" w:uiPriority="48"/>
+    <w:lsdException w:name="Grid Table 4 Accent 2" w:uiPriority="49"/>
+    <w:lsdException w:name="Grid Table 5 Dark Accent 2" w:uiPriority="50"/>
+    <w:lsdException w:name="Grid Table 6 Colorful Accent 2" w:uiPriority="51"/>
+    <w:lsdException w:name="Grid Table 7 Colorful Accent 2" w:uiPriority="52"/>
+    <w:lsdException w:name="Grid Table 1 Light Accent 3" w:uiPriority="46"/>
+    <w:lsdException w:name="Grid Table 2 Accent 3" w:uiPriority="47"/>
+    <w:lsdException w:name="Grid Table 3 Accent 3" w:uiPriority="48"/>
+    <w:lsdException w:name="Grid Table 4 Accent 3" w:uiPriority="49"/>
+    <w:lsdException w:name="Grid Table 5 Dark Accent 3" w:uiPriority="50"/>
+    <w:lsdException w:name="Grid Table 6 Colorful Accent 3" w:uiPriority="51"/>
+    <w:lsdException w:name="Grid Table 7 Colorful Accent 3" w:uiPriority="52"/>
+    <w:lsdException w:name="Grid Table 1 Light Accent 4" w:uiPriority="46"/>
+    <w:lsdException w:name="Grid Table 2 Accent 4" w:uiPriority="47"/>
+    <w:lsdException w:name="Grid Table 3 Accent 4" w:uiPriority="48"/>
+    <w:lsdException w:name="Grid Table 4 Accent 4" w:uiPriority="49"/>
+    <w:lsdException w:name="Grid Table 5 Dark Accent 4" w:uiPriority="50"/>
+    <w:lsdException w:name="Grid Table 6 Colorful Accent 4" w:uiPriority="51"/>
+    <w:lsdException w:name="Grid Table 7 Colorful Accent 4" w:uiPriority="52"/>
+    <w:lsdException w:name="Grid Table 1 Light Accent 5" w:uiPriority="46"/>
+    <w:lsdException w:name="Grid Table 2 Accent 5" w:uiPriority="47"/>
+    <w:lsdException w:name="Grid Table 3 Accent 5" w:uiPriority="48"/>
+    <w:lsdException w:name="Grid Table 4 Accent 5" w:uiPriority="49"/>
+    <w:lsdException w:name="Grid Table 5 Dark Accent 5" w:uiPriority="50"/>
+    <w:lsdException w:name="Grid Table 6 Colorful Accent 5" w:uiPriority="51"/>
+    <w:lsdException w:name="Grid Table 7 Colorful Accent 5" w:uiPriority="52"/>
+    <w:lsdException w:name="Grid Table 1 Light Accent 6" w:uiPriority="46"/>
+    <w:lsdException w:name="Grid Table 2 Accent 6" w:uiPriority="47"/>
+    <w:lsdException w:name="Grid Table 3 Accent 6" w:uiPriority="48"/>
+    <w:lsdException w:name="Grid Table 4 Accent 6" w:uiPriority="49"/>
+    <w:lsdException w:name="Grid Table 5 Dark Accent 6" w:uiPriority="50"/>
+    <w:lsdException w:name="Grid Table 6 Colorful Accent 6" w:uiPriority="51"/>
+    <w:lsdException w:name="Grid Table 7 Colorful Accent 6" w:uiPriority="52"/>
+    <w:lsdException w:name="List Table 1 Light" w:uiPriority="46"/>
+    <w:lsdException w:name="List Table 2" w:uiPriority="47"/>
+    <w:lsdException w:name="List Table 3" w:uiPriority="48"/>
+    <w:lsdException w:name="List Table 4" w:uiPriority="49"/>
+    <w:lsdException w:name="List Table 5 Dark" w:uiPriority="50"/>
+    <w:lsdException w:name="List Table 6 Colorful" w:uiPriority="51"/>
+    <w:lsdException w:name="List Table 7 Colorful" w:uiPriority="52"/>
+    <w:lsdException w:name="List Table 1 Light Accent 1" w:uiPriority="46"/>
+    <w:lsdException w:name="List Table 2 Accent 1" w:uiPriority="47"/>
+    <w:lsdException w:name="List Table 3 Accent 1" w:uiPriority="48"/>
+    <w:lsdException w:name="List Table 4 Accent 1" w:uiPriority="49"/>
+    <w:lsdException w:name="List Table 5 Dark Accent 1" w:uiPriority="50"/>
+    <w:lsdException w:name="List Table 6 Colorful Accent 1" w:uiPriority="51"/>
+    <w:lsdException w:name="List Table 7 Colorful Accent 1" w:uiPriority="52"/>
+    <w:lsdException w:name="List Table 1 Light Accent 2" w:uiPriority="46"/>
+    <w:lsdException w:name="List Table 2 Accent 2" w:uiPriority="47"/>
+    <w:lsdException w:name="List Table 3 Accent 2" w:uiPriority="48"/>
+    <w:lsdException w:name="List Table 4 Accent 2" w:uiPriority="49"/>
+    <w:lsdException w:name="List Table 5 Dark Accent 2" w:uiPriority="50"/>
+    <w:lsdException w:name="List Table 6 Colorful Accent 2" w:uiPriority="51"/>
+    <w:lsdException w:name="List Table 7 Colorful Accent 2" w:uiPriority="52"/>
+    <w:lsdException w:name="List Table 1 Light Accent 3" w:uiPriority="46"/>
+    <w:lsdException w:name="List Table 2 Accent 3" w:uiPriority="47"/>
+    <w:lsdException w:name="List Table 3 Accent 3" w:uiPriority="48"/>
+    <w:lsdException w:name="List Table 4 Accent 3" w:uiPriority="49"/>
+    <w:lsdException w:name="List Table 5 Dark Accent 3" w:uiPriority="50"/>
+    <w:lsdException w:name="List Table 6 Colorful Accent 3" w:uiPriority="51"/>
+    <w:lsdException w:name="List Table 7 Colorful Accent 3" w:uiPriority="52"/>
+    <w:lsdException w:name="List Table 1 Light Accent 4" w:uiPriority="46"/>
+    <w:lsdException w:name="List Table 2 Accent 4" w:uiPriority="47"/>
+    <w:lsdException w:name="List Table 3 Accent 4" w:uiPriority="48"/>
+    <w:lsdException w:name="List Table 4 Accent 4" w:uiPriority="49"/>
+    <w:lsdException w:name="List Table 5 Dark Accent 4" w:uiPriority="50"/>
+    <w:lsdException w:name="List Table 6 Colorful Accent 4" w:uiPriority="51"/>
+    <w:lsdException w:name="List Table 7 Colorful Accent 4" w:uiPriority="52"/>
+    <w:lsdException w:name="List Table 1 Light Accent 5" w:uiPriority="46"/>
+    <w:lsdException w:name="List Table 2 Accent 5" w:uiPriority="47"/>
+    <w:lsdException w:name="List Table 3 Accent 5" w:uiPriority="48"/>
+    <w:lsdException w:name="List Table 4 Accent 5" w:uiPriority="49"/>
+    <w:lsdException w:name="List Table 5 Dark Accent 5" w:uiPriority="50"/>
+    <w:lsdException w:name="List Table 6 Colorful Accent 5" w:uiPriority="51"/>
+    <w:lsdException w:name="List Table 7 Colorful Accent 5" w:uiPriority="52"/>
+    <w:lsdException w:name="List Table 1 Light Accent 6" w:uiPriority="46"/>
+    <w:lsdException w:name="List Table 2 Accent 6" w:uiPriority="47"/>
+    <w:lsdException w:name="List Table 3 Accent 6" w:uiPriority="48"/>
+    <w:lsdException w:name="List Table 4 Accent 6" w:uiPriority="49"/>
+    <w:lsdException w:name="List Table 5 Dark Accent 6" w:uiPriority="50"/>
+    <w:lsdException w:name="List Table 6 Colorful Accent 6" w:uiPriority="51"/>
+    <w:lsdException w:name="List Table 7 Colorful Accent 6" w:uiPriority="52"/>
+    <w:lsdException w:name="Mention" w:semiHidden="1" w:unhideWhenUsed="1"/>
+    <w:lsdException w:name="Smart Hyperlink" w:semiHidden="1" w:unhideWhenUsed="1"/>
+    <w:lsdException w:name="Hashtag" w:semiHidden="1" w:unhideWhenUsed="1"/>
+    <w:lsdException w:name="Unresolved Mention" w:semiHidden="1" w:unhideWhenUsed="1"/>
+    <w:lsdException w:name="Smart Link" w:semiHidden="1" w:unhideWhenUsed="1"/>
   </w:latentStyles>
-  <w:style w:type="paragraph" w:default="1" w:styleId="1">
+  <w:style w:type="paragraph" w:default="1" w:styleId="a">
     <w:name w:val="Normal"/>
     <w:qFormat/>
-    <w:uiPriority w:val="0"/>
     <w:pPr>
       <w:widowControl w:val="0"/>
       <w:jc w:val="both"/>
     </w:pPr>
     <w:rPr>
-      <w:rFonts w:ascii="Times New Roman" w:hAnsi="Times New Roman" w:eastAsia="宋体" w:cs="Times New Roman"/>
+      <w:rFonts w:ascii="Times New Roman" w:eastAsia="宋体" w:hAnsi="Times New Roman" w:cs="Times New Roman"/>
       <w:kern w:val="2"/>
       <w:sz w:val="21"/>
       <w:szCs w:val="24"/>
-      <w:lang w:val="en-US" w:eastAsia="zh-CN" w:bidi="ar-SA"/>
     </w:rPr>
   </w:style>
-  <w:style w:type="character" w:default="1" w:styleId="5">
+  <w:style w:type="character" w:default="1" w:styleId="a0">
     <w:name w:val="Default Paragraph Font"/>
+    <w:uiPriority w:val="1"/>
     <w:semiHidden/>
     <w:unhideWhenUsed/>
-    <w:uiPriority w:val="1"/>
   </w:style>
-  <w:style w:type="table" w:default="1" w:styleId="4">
+  <w:style w:type="table" w:default="1" w:styleId="a1">
     <w:name w:val="Normal Table"/>
+    <w:uiPriority w:val="99"/>
     <w:semiHidden/>
     <w:unhideWhenUsed/>
-    <w:uiPriority w:val="99"/>
     <w:tblPr>
+      <w:tblInd w:w="0" w:type="dxa"/>
       <w:tblCellMar>
         <w:top w:w="0" w:type="dxa"/>
         <w:left w:w="108" w:type="dxa"/>
@@ -2131,12 +3344,18 @@
       </w:tblCellMar>
     </w:tblPr>
   </w:style>
-  <w:style w:type="paragraph" w:styleId="2">
+  <w:style w:type="numbering" w:default="1" w:styleId="a2">
+    <w:name w:val="No List"/>
+    <w:uiPriority w:val="99"/>
+    <w:semiHidden/>
+    <w:unhideWhenUsed/>
+  </w:style>
+  <w:style w:type="paragraph" w:styleId="a3">
     <w:name w:val="footer"/>
-    <w:basedOn w:val="1"/>
-    <w:link w:val="7"/>
+    <w:basedOn w:val="a"/>
+    <w:link w:val="a4"/>
+    <w:uiPriority w:val="99"/>
     <w:unhideWhenUsed/>
-    <w:uiPriority w:val="99"/>
     <w:pPr>
       <w:tabs>
         <w:tab w:val="center" w:pos="4153"/>
@@ -2150,15 +3369,15 @@
       <w:szCs w:val="18"/>
     </w:rPr>
   </w:style>
-  <w:style w:type="paragraph" w:styleId="3">
+  <w:style w:type="paragraph" w:styleId="a5">
     <w:name w:val="header"/>
-    <w:basedOn w:val="1"/>
-    <w:link w:val="6"/>
+    <w:basedOn w:val="a"/>
+    <w:link w:val="a6"/>
+    <w:uiPriority w:val="99"/>
     <w:unhideWhenUsed/>
-    <w:uiPriority w:val="99"/>
     <w:pPr>
       <w:pBdr>
-        <w:bottom w:val="single" w:color="auto" w:sz="6" w:space="1"/>
+        <w:bottom w:val="single" w:sz="6" w:space="1" w:color="auto"/>
       </w:pBdr>
       <w:tabs>
         <w:tab w:val="center" w:pos="4153"/>
@@ -2172,26 +3391,26 @@
       <w:szCs w:val="18"/>
     </w:rPr>
   </w:style>
-  <w:style w:type="character" w:customStyle="1" w:styleId="6">
-    <w:name w:val="页眉 Char"/>
-    <w:basedOn w:val="5"/>
-    <w:link w:val="3"/>
+  <w:style w:type="character" w:customStyle="1" w:styleId="a6">
+    <w:name w:val="页眉 字符"/>
+    <w:basedOn w:val="a0"/>
+    <w:link w:val="a5"/>
+    <w:uiPriority w:val="99"/>
     <w:qFormat/>
-    <w:uiPriority w:val="99"/>
     <w:rPr>
-      <w:rFonts w:ascii="Times New Roman" w:hAnsi="Times New Roman" w:eastAsia="宋体" w:cs="Times New Roman"/>
+      <w:rFonts w:ascii="Times New Roman" w:eastAsia="宋体" w:hAnsi="Times New Roman" w:cs="Times New Roman"/>
       <w:sz w:val="18"/>
       <w:szCs w:val="18"/>
     </w:rPr>
   </w:style>
-  <w:style w:type="character" w:customStyle="1" w:styleId="7">
-    <w:name w:val="页脚 Char"/>
-    <w:basedOn w:val="5"/>
-    <w:link w:val="2"/>
+  <w:style w:type="character" w:customStyle="1" w:styleId="a4">
+    <w:name w:val="页脚 字符"/>
+    <w:basedOn w:val="a0"/>
+    <w:link w:val="a3"/>
+    <w:uiPriority w:val="99"/>
     <w:qFormat/>
-    <w:uiPriority w:val="99"/>
     <w:rPr>
-      <w:rFonts w:ascii="Times New Roman" w:hAnsi="Times New Roman" w:eastAsia="宋体" w:cs="Times New Roman"/>
+      <w:rFonts w:ascii="Times New Roman" w:eastAsia="宋体" w:hAnsi="Times New Roman" w:cs="Times New Roman"/>
       <w:sz w:val="18"/>
       <w:szCs w:val="18"/>
     </w:rPr>
@@ -2451,5 +3670,6 @@
     </a:fmtScheme>
   </a:themeElements>
   <a:objectDefaults/>
+  <a:extraClrSchemeLst/>
 </a:theme>
 </file>
</xml_diff>